<commit_message>
Refocus landing and docs for high-value investors; compress to 1-week backend sprint
- Landing: hero and stats now target ₦10M–₦100M+ allocations, term-based
  22.5% ROI and quarterly dividends inside the app; calculator range
  updated to ₦10M–₦100M, features highlight wallet/portfolio tracking.

- PROJECT_SUMMARY.md: mark frontend complete and all 19 sides confirmed,
  detail 7-day backend-only sprint (auth→properties→trustee→wallet→
  portfolio→integration→testing/launch).

- Urbco_Project_Plan.docx: regenerated as high-investment edition —
  daily D1–D7 backend plan, frontend frozen, testing built in every day.
</commit_message>
<xml_diff>
--- a/Urbco_Project_Plan.docx
+++ b/Urbco_Project_Plan.docx
@@ -24,7 +24,7 @@
           <w:color w:val="D4A065"/>
           <w:sz w:val="15"/>
         </w:rPr>
-        <w:t>TRUSTEE-SECURED  •  FRACTIONAL REAL ESTATE  •  NIGERIA</w:t>
+        <w:t>FOR HIGH-VALUE INVESTORS  •  TRUSTEE-SECURED  •  TERM BASED ROI</w:t>
       </w:r>
     </w:p>
     <w:p>
@@ -50,11 +50,10 @@
       <w:r>
         <w:rPr>
           <w:rFonts w:ascii="Calibri" w:hAnsi="Calibri"/>
-          <w:b w:val="0"/>
           <w:color w:val="1E293B"/>
-          <w:sz w:val="36"/>
+          <w:sz w:val="32"/>
         </w:rPr>
-        <w:t>Project Plan</w:t>
+        <w:t>Project Plan — High-Investment Edition</w:t>
       </w:r>
     </w:p>
     <w:p>
@@ -72,7 +71,7 @@
     </w:p>
     <w:p>
       <w:pPr>
-        <w:spacing w:after="400"/>
+        <w:spacing w:after="120"/>
         <w:jc w:val="center"/>
       </w:pPr>
       <w:r>
@@ -80,11 +79,25 @@
           <w:rFonts w:ascii="Calibri" w:hAnsi="Calibri"/>
           <w:i/>
           <w:color w:val="475569"/>
-          <w:sz w:val="19"/>
+          <w:sz w:val="20"/>
         </w:rPr>
-        <w:t>Build plan for CEO &amp; Developer review  •  Includes phased delivery,</w:t>
+        <w:t>Frontend complete. All sides confirmed.</w:t>
         <w:br/>
-        <w:t>architecture, workflow, and testing strategy from day one.</w:t>
+        <w:t>Backend to build in 1 week. Testing included from day one.</w:t>
+      </w:r>
+    </w:p>
+    <w:p>
+      <w:pPr>
+        <w:jc w:val="center"/>
+      </w:pPr>
+      <w:r>
+        <w:rPr>
+          <w:rFonts w:ascii="Calibri" w:hAnsi="Calibri"/>
+          <w:b/>
+          <w:color w:val="64748B"/>
+          <w:sz w:val="17"/>
+        </w:rPr>
+        <w:t>Large capital • Fixed-term returns • Quarterly dividends inside the app • Trustee-held until milestones</w:t>
       </w:r>
     </w:p>
     <w:tbl>
@@ -226,7 +239,7 @@
                 <w:color w:val="333333"/>
                 <w:sz w:val="16"/>
               </w:rPr>
-              <w:t>v1.0  •  September 13, 2026</w:t>
+              <w:t>v1.1 — High-Investment Edition  •  September 2026</w:t>
             </w:r>
           </w:p>
         </w:tc>
@@ -292,6 +305,92 @@
                 <w:color w:val="333333"/>
                 <w:sz w:val="16"/>
               </w:rPr>
+              <w:t>Frontend Status</w:t>
+            </w:r>
+          </w:p>
+        </w:tc>
+        <w:tc>
+          <w:tcPr>
+            <w:tcW w:type="dxa" w:w="7200"/>
+            <w:vAlign w:val="center"/>
+          </w:tcPr>
+          <w:p>
+            <w:pPr>
+              <w:spacing w:after="40" w:before="40"/>
+              <w:jc w:val="left"/>
+            </w:pPr>
+            <w:r>
+              <w:rPr>
+                <w:rFonts w:ascii="Calibri" w:hAnsi="Calibri"/>
+                <w:color w:val="333333"/>
+                <w:sz w:val="16"/>
+              </w:rPr>
+              <w:t>✅ Complete — 19 routes/sides confirmed (see Appendix A)</w:t>
+            </w:r>
+          </w:p>
+        </w:tc>
+      </w:tr>
+      <w:tr>
+        <w:tc>
+          <w:tcPr>
+            <w:tcW w:type="dxa" w:w="2304"/>
+            <w:vAlign w:val="center"/>
+          </w:tcPr>
+          <w:p>
+            <w:pPr>
+              <w:spacing w:after="40" w:before="40"/>
+              <w:jc w:val="left"/>
+            </w:pPr>
+            <w:r>
+              <w:rPr>
+                <w:rFonts w:ascii="Calibri" w:hAnsi="Calibri"/>
+                <w:b/>
+                <w:color w:val="333333"/>
+                <w:sz w:val="16"/>
+              </w:rPr>
+              <w:t>Backend Sprint</w:t>
+            </w:r>
+          </w:p>
+        </w:tc>
+        <w:tc>
+          <w:tcPr>
+            <w:tcW w:type="dxa" w:w="7200"/>
+            <w:vAlign w:val="center"/>
+          </w:tcPr>
+          <w:p>
+            <w:pPr>
+              <w:spacing w:after="40" w:before="40"/>
+              <w:jc w:val="left"/>
+            </w:pPr>
+            <w:r>
+              <w:rPr>
+                <w:rFonts w:ascii="Calibri" w:hAnsi="Calibri"/>
+                <w:color w:val="333333"/>
+                <w:sz w:val="16"/>
+              </w:rPr>
+              <w:t>⏱ 7 Days Only — All UI sides frozen; backend + integration + testing</w:t>
+            </w:r>
+          </w:p>
+        </w:tc>
+      </w:tr>
+      <w:tr>
+        <w:tc>
+          <w:tcPr>
+            <w:tcW w:type="dxa" w:w="2304"/>
+            <w:vAlign w:val="center"/>
+          </w:tcPr>
+          <w:p>
+            <w:pPr>
+              <w:spacing w:after="40" w:before="40"/>
+              <w:jc w:val="left"/>
+            </w:pPr>
+            <w:r>
+              <w:rPr>
+                <w:rFonts w:ascii="Calibri" w:hAnsi="Calibri"/>
+                <w:b/>
+                <w:color w:val="333333"/>
+                <w:sz w:val="16"/>
+              </w:rPr>
               <w:t>Deployment</w:t>
             </w:r>
           </w:p>
@@ -317,49 +416,6 @@
           </w:p>
         </w:tc>
       </w:tr>
-      <w:tr>
-        <w:tc>
-          <w:tcPr>
-            <w:tcW w:type="dxa" w:w="2304"/>
-            <w:vAlign w:val="center"/>
-          </w:tcPr>
-          <w:p>
-            <w:pPr>
-              <w:spacing w:after="40" w:before="40"/>
-              <w:jc w:val="left"/>
-            </w:pPr>
-            <w:r>
-              <w:rPr>
-                <w:rFonts w:ascii="Calibri" w:hAnsi="Calibri"/>
-                <w:b/>
-                <w:color w:val="333333"/>
-                <w:sz w:val="16"/>
-              </w:rPr>
-              <w:t>Status</w:t>
-            </w:r>
-          </w:p>
-        </w:tc>
-        <w:tc>
-          <w:tcPr>
-            <w:tcW w:type="dxa" w:w="7200"/>
-            <w:vAlign w:val="center"/>
-          </w:tcPr>
-          <w:p>
-            <w:pPr>
-              <w:spacing w:after="40" w:before="40"/>
-              <w:jc w:val="left"/>
-            </w:pPr>
-            <w:r>
-              <w:rPr>
-                <w:rFonts w:ascii="Calibri" w:hAnsi="Calibri"/>
-                <w:color w:val="333333"/>
-                <w:sz w:val="16"/>
-              </w:rPr>
-              <w:t>Draft for Review — Approval required before M1 kickoff</w:t>
-            </w:r>
-          </w:p>
-        </w:tc>
-      </w:tr>
     </w:tbl>
     <w:p>
       <w:pPr>
@@ -379,7 +435,7 @@
           <w:color w:val="9A5A13"/>
           <w:sz w:val="16"/>
         </w:rPr>
-        <w:t xml:space="preserve">How to use this doc:  </w:t>
+        <w:t xml:space="preserve">How to use:  </w:t>
       </w:r>
       <w:r>
         <w:rPr>
@@ -387,7 +443,7 @@
           <w:color w:val="7C5A2A"/>
           <w:sz w:val="16"/>
         </w:rPr>
-        <w:t>Review sections 1–7 together in a 60-min session, then sign off on Next Steps (p. last). Comments can be added directly in Google Docs after import.</w:t>
+        <w:t>Review together in a 45-min session (cover 1-week plan + high-investment positioning). CEO signs off on trustee milestones; Dev confirms backend day plan. Comments directly in Google Docs after import. View → Show outline for navigation.</w:t>
       </w:r>
     </w:p>
     <w:p>
@@ -420,7 +476,7 @@
           <w:color w:val="333333"/>
           <w:sz w:val="19"/>
         </w:rPr>
-        <w:t>Urbco lets everyday Nigerians own a fraction of premium real estate from ₦500,000 and earn up to 22.5% annually through rental income and capital appreciation. The core differentiator is trustee-held, milestone-gated funding: investors send money to independent trustees — not directly to developers. Trustees hold the capital safely and release it only when the developer reaches verified milestones. That layer of trust is the product promise and must be visible in every investor touchpoint.</w:t>
+        <w:t>Urbco is now positioned for high-value investors who deploy large capital — ₦10M to ₦100M+ per asset — and earn term-based ROI (up to 22.5% p.a.). Instead of fragmented retail tickets, investors make a single large allocation that is held by independent trustees until construction milestones are verified. Quarterly dividends are paid directly to the in-app wallet, and the portfolio inside the app shows live valuation, allocation, and term progress. At the end of the fixed term, capital plus returns are settled.</w:t>
       </w:r>
     </w:p>
     <w:p>
@@ -435,7 +491,22 @@
           <w:color w:val="475569"/>
           <w:sz w:val="19"/>
         </w:rPr>
-        <w:t>This plan defines what we will build for the MVP, how we will build it (stack, architecture, workflow), the phased timeline, and how testing is integrated from the start — not bolted on at the end. It is written for a joint review so the CEO can align on vision/scope and the developer can align on implementation and estimation.</w:t>
+        <w:t>Frontend is complete and all sides/pages are confirmed (landing, auth, marketplace, asset detail, checkout, portfolio, dividends, wallet, referrals, notifications, profile/KYC, settings, dashboard). This plan covers only the backend build — a 7-day sprint to deliver APIs, trustee milestone logic, and full integration — with testing built in every day, not after.</w:t>
+      </w:r>
+    </w:p>
+    <w:p>
+      <w:pPr>
+        <w:spacing w:after="80" w:before="0" w:line="264" w:lineRule="auto"/>
+      </w:pPr>
+      <w:r>
+        <w:rPr>
+          <w:rFonts w:ascii="Calibri" w:hAnsi="Calibri"/>
+          <w:b/>
+          <w:i w:val="0"/>
+          <w:color w:val="870F73"/>
+          <w:sz w:val="19"/>
+        </w:rPr>
+        <w:t>Outcome after 1 week: investor can allocate millions → see “Held by Trustees” → receive quarterly dividends in wallet → track ROI in portfolio → receive capital+ROI at term — fully live on Vercel production.</w:t>
       </w:r>
     </w:p>
     <w:p>
@@ -468,7 +539,7 @@
           <w:color w:val="1E293B"/>
           <w:sz w:val="22"/>
         </w:rPr>
-        <w:t>Primary objectives</w:t>
+        <w:t>Objectives (high-investment focus)</w:t>
       </w:r>
     </w:p>
     <w:p>
@@ -484,7 +555,7 @@
           <w:color w:val="333333"/>
           <w:sz w:val="18"/>
         </w:rPr>
-        <w:t>Launch investor web app covering: landing (investment &amp; returns focus), auth + light KYC, marketplace, asset detail, checkout, portfolio/dashboard, wallet &amp; dividends, referrals, notifications, about/services.</w:t>
+        <w:t>Serve high-value investors: single large allocation (₦10M–₦100M+) per asset, not instalments, with fixed-term ROI and quarterly dividends paid inside the app.</w:t>
       </w:r>
     </w:p>
     <w:p>
@@ -500,7 +571,7 @@
           <w:color w:val="333333"/>
           <w:sz w:val="18"/>
         </w:rPr>
-        <w:t>Make the trustee model tangible in UI and API contracts — investors must see where their money sits and when it moves.</w:t>
+        <w:t>Make trustee security tangible: every investment shows “Held by Trustees → Released on Milestone” and the wallet/portfolio reflect dividend flows.</w:t>
       </w:r>
     </w:p>
     <w:p>
@@ -516,7 +587,7 @@
           <w:color w:val="333333"/>
           <w:sz w:val="18"/>
         </w:rPr>
-        <w:t>Ship to production on Vercel with 99.5% uptime, Lighthouse LCP &lt; 2s, and zero critical/high security findings at launch.</w:t>
+        <w:t>Keep frontend frozen; deliver backend in 7 days — auth/KYC, properties/marketplace, investments/trustee, wallet/dividends, portfolio/notifications — wired to the confirmed UI sides.</w:t>
       </w:r>
     </w:p>
     <w:p>
@@ -532,7 +603,7 @@
           <w:color w:val="333333"/>
           <w:sz w:val="18"/>
         </w:rPr>
-        <w:t>Establish investor trust through transparent funding progress, milestone tracking, and quarterly earnings reporting.</w:t>
+        <w:t>Ship to Vercel prod with 99.5% uptime, LCP &lt;2s, zero critical security issues, and E2E critical paths green.</w:t>
       </w:r>
     </w:p>
     <w:p>
@@ -547,7 +618,7 @@
           <w:color w:val="1E293B"/>
           <w:sz w:val="22"/>
         </w:rPr>
-        <w:t>Measurable success criteria at launch</w:t>
+        <w:t>Success criteria after 7 days</w:t>
       </w:r>
     </w:p>
     <w:tbl>
@@ -626,7 +697,7 @@
                 <w:color w:val="333333"/>
                 <w:sz w:val="16"/>
               </w:rPr>
-              <w:t>Investor flow</w:t>
+              <w:t>Large allocation flow</w:t>
             </w:r>
           </w:p>
         </w:tc>
@@ -646,7 +717,7 @@
                 <w:color w:val="333333"/>
                 <w:sz w:val="16"/>
               </w:rPr>
-              <w:t>Signup → marketplace → asset → checkout → portfolio completes &lt; 3 min on staging</w:t>
+              <w:t>Allocate ₦10M+ → checkout → portfolio shows holding + term ROI in &lt;3 min</w:t>
             </w:r>
           </w:p>
         </w:tc>
@@ -689,7 +760,50 @@
                 <w:color w:val="333333"/>
                 <w:sz w:val="16"/>
               </w:rPr>
-              <w:t>Every funding step shows 'Held by Trustees / Released on Milestone' copy</w:t>
+              <w:t>All investments display Held by Trustees / Released on Milestone; wallet shows dividend source</w:t>
+            </w:r>
+          </w:p>
+        </w:tc>
+      </w:tr>
+      <w:tr>
+        <w:tc>
+          <w:tcPr>
+            <w:tcW w:type="dxa" w:w="2592"/>
+            <w:vAlign w:val="center"/>
+          </w:tcPr>
+          <w:p>
+            <w:pPr>
+              <w:spacing w:after="40" w:before="40"/>
+              <w:jc w:val="left"/>
+            </w:pPr>
+            <w:r>
+              <w:rPr>
+                <w:rFonts w:ascii="Calibri" w:hAnsi="Calibri"/>
+                <w:b/>
+                <w:color w:val="333333"/>
+                <w:sz w:val="16"/>
+              </w:rPr>
+              <w:t>Dividends in app</w:t>
+            </w:r>
+          </w:p>
+        </w:tc>
+        <w:tc>
+          <w:tcPr>
+            <w:tcW w:type="dxa" w:w="6912"/>
+            <w:vAlign w:val="center"/>
+          </w:tcPr>
+          <w:p>
+            <w:pPr>
+              <w:spacing w:after="40" w:before="40"/>
+              <w:jc w:val="left"/>
+            </w:pPr>
+            <w:r>
+              <w:rPr>
+                <w:rFonts w:ascii="Calibri" w:hAnsi="Calibri"/>
+                <w:color w:val="333333"/>
+                <w:sz w:val="16"/>
+              </w:rPr>
+              <w:t>Quarterly dividends land in Wallet, visible in Portfolio &amp; Dividends history</w:t>
             </w:r>
           </w:p>
         </w:tc>
@@ -732,7 +846,7 @@
                 <w:color w:val="333333"/>
                 <w:sz w:val="16"/>
               </w:rPr>
-              <w:t>Unit + integration coverage &gt; 70%; all P0/P1 bugs closed; E2E critical paths green</w:t>
+              <w:t>Coverage &gt;70% (unit+integration), all P0/P1 bugs closed, E2E large-ticket scenarios green</w:t>
             </w:r>
           </w:p>
         </w:tc>
@@ -755,7 +869,7 @@
                 <w:color w:val="333333"/>
                 <w:sz w:val="16"/>
               </w:rPr>
-              <w:t>Performance</w:t>
+              <w:t>Performance &amp; security</w:t>
             </w:r>
           </w:p>
         </w:tc>
@@ -775,50 +889,7 @@
                 <w:color w:val="333333"/>
                 <w:sz w:val="16"/>
               </w:rPr>
-              <w:t>Lighthouse ≥ 90 (perf), LCP &lt; 2s on 4G, CLS &lt; 0.1</w:t>
-            </w:r>
-          </w:p>
-        </w:tc>
-      </w:tr>
-      <w:tr>
-        <w:tc>
-          <w:tcPr>
-            <w:tcW w:type="dxa" w:w="2592"/>
-            <w:vAlign w:val="center"/>
-          </w:tcPr>
-          <w:p>
-            <w:pPr>
-              <w:spacing w:after="40" w:before="40"/>
-              <w:jc w:val="left"/>
-            </w:pPr>
-            <w:r>
-              <w:rPr>
-                <w:rFonts w:ascii="Calibri" w:hAnsi="Calibri"/>
-                <w:b/>
-                <w:color w:val="333333"/>
-                <w:sz w:val="16"/>
-              </w:rPr>
-              <w:t>Security</w:t>
-            </w:r>
-          </w:p>
-        </w:tc>
-        <w:tc>
-          <w:tcPr>
-            <w:tcW w:type="dxa" w:w="6912"/>
-            <w:vAlign w:val="center"/>
-          </w:tcPr>
-          <w:p>
-            <w:pPr>
-              <w:spacing w:after="40" w:before="40"/>
-              <w:jc w:val="left"/>
-            </w:pPr>
-            <w:r>
-              <w:rPr>
-                <w:rFonts w:ascii="Calibri" w:hAnsi="Calibri"/>
-                <w:color w:val="333333"/>
-                <w:sz w:val="16"/>
-              </w:rPr>
-              <w:t>npm audit 0 high/critical; security headers verified in vercel.json</w:t>
+              <w:t>Lighthouse ≥90, LCP &lt;2s; npm audit 0 high/critical; headers verified</w:t>
             </w:r>
           </w:p>
         </w:tc>
@@ -1009,7 +1080,7 @@
                 <w:color w:val="333333"/>
                 <w:sz w:val="16"/>
               </w:rPr>
-              <w:t>Vision, trustee partnerships, copy sign-off, go/no-go on releases</w:t>
+              <w:t>High-investment positioning, trustee milestone definitions, copy &amp; go/no-go</w:t>
             </w:r>
           </w:p>
         </w:tc>
@@ -1029,7 +1100,7 @@
                 <w:color w:val="333333"/>
                 <w:sz w:val="16"/>
               </w:rPr>
-              <w:t>Scope, launch date</w:t>
+              <w:t>Scope, launch</w:t>
             </w:r>
           </w:p>
         </w:tc>
@@ -1052,7 +1123,7 @@
                 <w:color w:val="333333"/>
                 <w:sz w:val="16"/>
               </w:rPr>
-              <w:t>Tech Lead / Developer(s)</w:t>
+              <w:t>Backend Dev(s)</w:t>
             </w:r>
           </w:p>
         </w:tc>
@@ -1092,7 +1163,7 @@
                 <w:color w:val="333333"/>
                 <w:sz w:val="16"/>
               </w:rPr>
-              <w:t>Architecture, build, code review, CI/CD, deploy</w:t>
+              <w:t>7-day backend build, API contracts, integration, deploy</w:t>
             </w:r>
           </w:p>
         </w:tc>
@@ -1155,7 +1226,7 @@
                 <w:color w:val="333333"/>
                 <w:sz w:val="16"/>
               </w:rPr>
-              <w:t>Dev + external QA</w:t>
+              <w:t>Dev + QA</w:t>
             </w:r>
           </w:p>
         </w:tc>
@@ -1175,7 +1246,7 @@
                 <w:color w:val="333333"/>
                 <w:sz w:val="16"/>
               </w:rPr>
-              <w:t>Test plan, manual + automated testing, bug triage</w:t>
+              <w:t>Test plan daily, manual + automated, bug triage</w:t>
             </w:r>
           </w:p>
         </w:tc>
@@ -1218,7 +1289,7 @@
                 <w:color w:val="333333"/>
                 <w:sz w:val="16"/>
               </w:rPr>
-              <w:t>Design / Product</w:t>
+              <w:t>Design</w:t>
             </w:r>
           </w:p>
         </w:tc>
@@ -1258,7 +1329,7 @@
                 <w:color w:val="333333"/>
                 <w:sz w:val="16"/>
               </w:rPr>
-              <w:t>Figma, UX, investment-focused hero + returns messaging</w:t>
+              <w:t>Already delivered — 19 sides confirmed; minor copy tweaks only</w:t>
             </w:r>
           </w:p>
         </w:tc>
@@ -1278,7 +1349,7 @@
                 <w:color w:val="333333"/>
                 <w:sz w:val="16"/>
               </w:rPr>
-              <w:t>UX approval</w:t>
+              <w:t>UX frozen</w:t>
             </w:r>
           </w:p>
         </w:tc>
@@ -1288,6 +1359,21 @@
       <w:pPr>
         <w:spacing w:after="80"/>
       </w:pPr>
+    </w:p>
+    <w:p>
+      <w:pPr>
+        <w:spacing w:after="80" w:before="0" w:line="264" w:lineRule="auto"/>
+      </w:pPr>
+      <w:r>
+        <w:rPr>
+          <w:rFonts w:ascii="Calibri" w:hAnsi="Calibri"/>
+          <w:b w:val="0"/>
+          <w:i/>
+          <w:color w:val="475569"/>
+          <w:sz w:val="17"/>
+        </w:rPr>
+        <w:t>Note: Frontend is frozen — no UI redesign during the 7-day sprint. Only wiring and backend logic. All sides are confirmed.</w:t>
+      </w:r>
     </w:p>
     <w:p>
       <w:pPr>
@@ -1319,7 +1405,7 @@
           <w:color w:val="1E293B"/>
           <w:sz w:val="22"/>
         </w:rPr>
-        <w:t>In scope — MVP</w:t>
+        <w:t>In scope — MVP (high-investment, 7-day backend)</w:t>
       </w:r>
     </w:p>
     <w:p>
@@ -1335,7 +1421,7 @@
           <w:color w:val="333333"/>
           <w:sz w:val="18"/>
         </w:rPr>
-        <w:t>Landing: investment-led hero ("Invest in real estate. Earn up to 22.5% annually."), stats band (Trustee-Protected Capital), How It Works (trustee flow), featured assets, ROI calculator, investor stories, CTA.</w:t>
+        <w:t>Landing (confirmed): hero “Deploy Large Capital. Earn Term-Based ROI.” — badge For High-Value Investors, stats Avg Ticket ₦15M+ / 22.5% term ROI, How High-Value Capital Grows, dividends-in-app features, calculator ₦10M–₦100M, testimonials from ₦25M–₦50M investors.</w:t>
       </w:r>
     </w:p>
     <w:p>
@@ -1351,7 +1437,7 @@
           <w:color w:val="333333"/>
           <w:sz w:val="18"/>
         </w:rPr>
-        <w:t>Auth: signup, login, OTP verification, forgot-password, light KYC (profile page).</w:t>
+        <w:t>Auth + KYC: signup, login, OTP, forgot-password, profile/KYC document upload — JWT auth backend.</w:t>
       </w:r>
     </w:p>
     <w:p>
@@ -1367,7 +1453,7 @@
           <w:color w:val="333333"/>
           <w:sz w:val="18"/>
         </w:rPr>
-        <w:t>Marketplace: live opportunities, filtering, funding progress bars.</w:t>
+        <w:t>Marketplace &amp; Asset Detail: live opportunities for large tickets, funding progress, trustee milestone markers.</w:t>
       </w:r>
     </w:p>
     <w:p>
@@ -1383,7 +1469,7 @@
           <w:color w:val="333333"/>
           <w:sz w:val="18"/>
         </w:rPr>
-        <w:t>Asset detail (/assets/[id]), checkout (/checkout/[id]) + success, portfolio, dashboard, wallet, dividends, referrals, notifications, settings.</w:t>
+        <w:t>Checkout: single large allocation (no instalments), trustee hold, success + receipt.</w:t>
       </w:r>
     </w:p>
     <w:p>
@@ -1399,22 +1485,7 @@
           <w:color w:val="333333"/>
           <w:sz w:val="18"/>
         </w:rPr>
-        <w:t>About / Services pages, responsive layout, dark landing theme.</w:t>
-      </w:r>
-    </w:p>
-    <w:p>
-      <w:pPr>
-        <w:pStyle w:val="Heading2"/>
-        <w:spacing w:before="200" w:after="120"/>
-      </w:pPr>
-      <w:r>
-        <w:rPr>
-          <w:rFonts w:ascii="Calibri" w:hAnsi="Calibri"/>
-          <w:b/>
-          <w:color w:val="1E293B"/>
-          <w:sz w:val="22"/>
-        </w:rPr>
-        <w:t>Out of scope — Phase 2 (post-MVP)</w:t>
+        <w:t>Portfolio + Dividends + Wallet + Referrals + Notifications + Settings: all confirmed sides — wire to backend; dividends quarterly to wallet.</w:t>
       </w:r>
     </w:p>
     <w:p>
@@ -1430,7 +1501,22 @@
           <w:color w:val="333333"/>
           <w:sz w:val="18"/>
         </w:rPr>
-        <w:t>Secondary market / trading of fractions between investors.</w:t>
+        <w:t>Dashboard: growth chart, allocation donut, upcoming dividends — live data.</w:t>
+      </w:r>
+    </w:p>
+    <w:p>
+      <w:pPr>
+        <w:pStyle w:val="Heading2"/>
+        <w:spacing w:before="200" w:after="120"/>
+      </w:pPr>
+      <w:r>
+        <w:rPr>
+          <w:rFonts w:ascii="Calibri" w:hAnsi="Calibri"/>
+          <w:b/>
+          <w:color w:val="1E293B"/>
+          <w:sz w:val="22"/>
+        </w:rPr>
+        <w:t>Out of scope — Phase 2</w:t>
       </w:r>
     </w:p>
     <w:p>
@@ -1446,7 +1532,7 @@
           <w:color w:val="333333"/>
           <w:sz w:val="18"/>
         </w:rPr>
-        <w:t>Dedicated admin &amp; trustee dashboards (milestone verification tooling).</w:t>
+        <w:t>Fractional retail instalments (3/6/12 months) — not needed for high-value term model (full allocation only).</w:t>
       </w:r>
     </w:p>
     <w:p>
@@ -1462,7 +1548,7 @@
           <w:color w:val="333333"/>
           <w:sz w:val="18"/>
         </w:rPr>
-        <w:t>Native mobile apps (iOS/Android) — web is primary.</w:t>
+        <w:t>Secondary market trading between investors.</w:t>
       </w:r>
     </w:p>
     <w:p>
@@ -1478,37 +1564,23 @@
           <w:color w:val="333333"/>
           <w:sz w:val="18"/>
         </w:rPr>
-        <w:t>Advanced KYC/AML provider swap and full document verification.</w:t>
+        <w:t>Dedicated trustee/admin verification dashboard (use manual milestone confirmation in sprint; automate later).</w:t>
       </w:r>
     </w:p>
     <w:p>
       <w:pPr>
-        <w:pStyle w:val="Heading3"/>
-        <w:spacing w:before="200" w:after="120"/>
-      </w:pPr>
-      <w:r>
-        <w:rPr>
-          <w:rFonts w:ascii="Calibri" w:hAnsi="Calibri"/>
-          <w:b/>
-          <w:color w:val="475569"/>
-          <w:sz w:val="18"/>
-        </w:rPr>
-        <w:t>Current codebase note</w:t>
-      </w:r>
-    </w:p>
-    <w:p>
-      <w:pPr>
+        <w:pStyle w:val="ListBullet"/>
         <w:spacing w:after="80" w:before="0" w:line="264" w:lineRule="auto"/>
       </w:pPr>
       <w:r>
         <w:rPr>
           <w:rFonts w:ascii="Calibri" w:hAnsi="Calibri"/>
           <w:b w:val="0"/>
-          <w:i/>
-          <w:color w:val="475569"/>
-          <w:sz w:val="17"/>
+          <w:i w:val="0"/>
+          <w:color w:val="333333"/>
+          <w:sz w:val="18"/>
         </w:rPr>
-        <w:t>Repo already contains Next.js scaffolding, landing page, auth pages, marketplace, mock data, vercel.json security headers, and Vercel deployment. MVP builds on this foundation rather than starting from zero.</w:t>
+        <w:t>Native mobile apps — web is primary.</w:t>
       </w:r>
     </w:p>
     <w:p>
@@ -1605,7 +1677,7 @@
                 <w:color w:val="333333"/>
                 <w:sz w:val="16"/>
               </w:rPr>
-              <w:t>Frontend</w:t>
+              <w:t>Frontend (DONE)</w:t>
             </w:r>
           </w:p>
         </w:tc>
@@ -1625,7 +1697,7 @@
                 <w:color w:val="333333"/>
                 <w:sz w:val="16"/>
               </w:rPr>
-              <w:t>Next.js 16.2.6 (App Router), React 19.2.4, TypeScript 5.8</w:t>
+              <w:t>Next.js 16.2.6 App Router, React 19.2.4, TS 5.8, Tailwind 4, Radix, Framer, Recharts, Zustand — 19 routes confirmed</w:t>
             </w:r>
           </w:p>
         </w:tc>
@@ -1648,7 +1720,7 @@
                 <w:color w:val="333333"/>
                 <w:sz w:val="16"/>
               </w:rPr>
-              <w:t>Styling</w:t>
+              <w:t>Backend to build (7 days)</w:t>
             </w:r>
           </w:p>
         </w:tc>
@@ -1668,7 +1740,7 @@
                 <w:color w:val="333333"/>
                 <w:sz w:val="16"/>
               </w:rPr>
-              <w:t>Tailwind CSS 4, Radix UI, Framer Motion, lucide-react icons</w:t>
+              <w:t>Node.js (or Python) API, PostgreSQL, Prisma/TypeORM, JWT, file storage (S3/R2), email/OTP provider</w:t>
             </w:r>
           </w:p>
         </w:tc>
@@ -1691,7 +1763,7 @@
                 <w:color w:val="333333"/>
                 <w:sz w:val="16"/>
               </w:rPr>
-              <w:t>State &amp; Data</w:t>
+              <w:t>API Contract</w:t>
             </w:r>
           </w:p>
         </w:tc>
@@ -1711,7 +1783,7 @@
                 <w:color w:val="333333"/>
                 <w:sz w:val="16"/>
               </w:rPr>
-              <w:t>Zustand (appStore), Recharts for portfolio visuals, lib/api.ts + lib/config.ts</w:t>
+              <w:t>NEXT_PUBLIC_API_URL=https://api.urbcoinvest.com; REST; types in src/types/index.ts, validation in src/lib/validations.ts</w:t>
             </w:r>
           </w:p>
         </w:tc>
@@ -1734,7 +1806,7 @@
                 <w:color w:val="333333"/>
                 <w:sz w:val="16"/>
               </w:rPr>
-              <w:t>Backend API</w:t>
+              <w:t>Trustee flow (backend)</w:t>
             </w:r>
           </w:p>
         </w:tc>
@@ -1754,7 +1826,7 @@
                 <w:color w:val="333333"/>
                 <w:sz w:val="16"/>
               </w:rPr>
-              <w:t>NEXT_PUBLIC_API_URL = https://api.urbcoinvest.com (REST)</w:t>
+              <w:t>investments table: status Held by Trustees → milestone verification → Released; dividends table: quarterly cron</w:t>
             </w:r>
           </w:p>
         </w:tc>
@@ -1797,50 +1869,7 @@
                 <w:color w:val="333333"/>
                 <w:sz w:val="16"/>
               </w:rPr>
-              <w:t>Vercel FRA1, framework: nextjs, build: npm run build, output: .next</w:t>
-            </w:r>
-          </w:p>
-        </w:tc>
-      </w:tr>
-      <w:tr>
-        <w:tc>
-          <w:tcPr>
-            <w:tcW w:type="dxa" w:w="2160"/>
-            <w:vAlign w:val="center"/>
-          </w:tcPr>
-          <w:p>
-            <w:pPr>
-              <w:spacing w:after="40" w:before="40"/>
-              <w:jc w:val="left"/>
-            </w:pPr>
-            <w:r>
-              <w:rPr>
-                <w:rFonts w:ascii="Calibri" w:hAnsi="Calibri"/>
-                <w:b/>
-                <w:color w:val="333333"/>
-                <w:sz w:val="16"/>
-              </w:rPr>
-              <w:t>Fonts</w:t>
-            </w:r>
-          </w:p>
-        </w:tc>
-        <w:tc>
-          <w:tcPr>
-            <w:tcW w:type="dxa" w:w="7344"/>
-            <w:vAlign w:val="center"/>
-          </w:tcPr>
-          <w:p>
-            <w:pPr>
-              <w:spacing w:after="40" w:before="40"/>
-              <w:jc w:val="left"/>
-            </w:pPr>
-            <w:r>
-              <w:rPr>
-                <w:rFonts w:ascii="Calibri" w:hAnsi="Calibri"/>
-                <w:color w:val="333333"/>
-                <w:sz w:val="16"/>
-              </w:rPr>
-              <w:t>Sora (display) + Inter (body) — defined in design tokens</w:t>
+              <w:t>Vercel FRA1, framework nextjs, build npm run build, output .next; GitHub main auto-deploys</w:t>
             </w:r>
           </w:p>
         </w:tc>
@@ -1883,7 +1912,7 @@
                 <w:color w:val="333333"/>
                 <w:sz w:val="16"/>
               </w:rPr>
-              <w:t>Headers in vercel.json: nosniff, DENY frame, XSS-block, strict-origin, Permissions-Policy</w:t>
+              <w:t>Headers in vercel.json (nosniff, DENY, XSS-block, strict-origin, Permissions-Policy); env flags ENABLE_*</w:t>
             </w:r>
           </w:p>
         </w:tc>
@@ -1906,7 +1935,7 @@
           <w:color w:val="1E293B"/>
           <w:sz w:val="18"/>
         </w:rPr>
-        <w:t>High-level flow</w:t>
+        <w:t>Confirmed sides (frontend frozen)</w:t>
       </w:r>
     </w:p>
     <w:p>
@@ -1919,9 +1948,9 @@
           <w:b w:val="0"/>
           <w:i/>
           <w:color w:val="475569"/>
-          <w:sz w:val="18"/>
+          <w:sz w:val="17"/>
         </w:rPr>
-        <w:t>Investor Browser → Vercel (Next.js) → api.urbcoinvest.com → Trustees ledger &amp; Developer milestone service → Webhooks → Investor dashboard updates (funding progress, dividends). All investor funds are recorded as "Held by Trustees" until milestone verification triggers a release.</w:t>
+        <w:t>19 routes: / (landing), /auth/login, /auth/signup, /auth/otp-verify, /auth/forgot-password, /marketplace (Own-a-Fraction), /assets/[id], /checkout/[id], /checkout/success, /dashboard, /portfolio, /dividends, /wallet, /referrals, /notifications, /profile, /profile/kyc, /settings, /about, /services. All responsive, with skeletons/empty states — no UI changes in backend sprint.</w:t>
       </w:r>
     </w:p>
     <w:p>
@@ -1939,7 +1968,7 @@
           <w:color w:val="870F73"/>
           <w:sz w:val="36"/>
         </w:rPr>
-        <w:t>6  Phased Delivery</w:t>
+        <w:t>6  1-Week Backend Sprint — Day-by-Day</w:t>
       </w:r>
     </w:p>
     <w:p>
@@ -1954,7 +1983,7 @@
           <w:color w:val="475569"/>
           <w:sz w:val="18"/>
         </w:rPr>
-        <w:t>Timeline assumes 1 full-time developer; compress by ~30% with 2 developers. Each phase ends with a demo and CEO sign-off.</w:t>
+        <w:t>Frontend ready. All sides confirmed and frozen. Only backend + integration + testing remain. Daily demo at 5pm with Vercel preview.</w:t>
       </w:r>
     </w:p>
     <w:tbl>
@@ -1966,11 +1995,34 @@
         <w:tblLook w:firstColumn="1" w:firstRow="1" w:lastColumn="0" w:lastRow="0" w:noHBand="0" w:noVBand="1" w:val="04A0"/>
       </w:tblPr>
       <w:tblGrid>
-        <w:gridCol w:w="3408"/>
-        <w:gridCol w:w="3408"/>
-        <w:gridCol w:w="3408"/>
+        <w:gridCol w:w="2556"/>
+        <w:gridCol w:w="2556"/>
+        <w:gridCol w:w="2556"/>
+        <w:gridCol w:w="2556"/>
       </w:tblGrid>
       <w:tr>
+        <w:tc>
+          <w:tcPr>
+            <w:tcW w:type="dxa" w:w="1008"/>
+            <w:vAlign w:val="center"/>
+            <w:shd w:val="clear" w:color="auto" w:fill="870F73"/>
+          </w:tcPr>
+          <w:p>
+            <w:pPr>
+              <w:spacing w:after="40" w:before="40"/>
+              <w:jc w:val="center"/>
+            </w:pPr>
+            <w:r>
+              <w:rPr>
+                <w:rFonts w:ascii="Calibri" w:hAnsi="Calibri"/>
+                <w:b/>
+                <w:color w:val="FFFFFF"/>
+                <w:sz w:val="16"/>
+              </w:rPr>
+              <w:t>Day</w:t>
+            </w:r>
+          </w:p>
+        </w:tc>
         <w:tc>
           <w:tcPr>
             <w:tcW w:type="dxa" w:w="1872"/>
@@ -1989,13 +2041,13 @@
                 <w:color w:val="FFFFFF"/>
                 <w:sz w:val="16"/>
               </w:rPr>
-              <w:t>Phase</w:t>
+              <w:t>Focus</w:t>
             </w:r>
           </w:p>
         </w:tc>
         <w:tc>
           <w:tcPr>
-            <w:tcW w:type="dxa" w:w="4320"/>
+            <w:tcW w:type="dxa" w:w="4032"/>
             <w:vAlign w:val="center"/>
             <w:shd w:val="clear" w:color="auto" w:fill="870F73"/>
           </w:tcPr>
@@ -2017,7 +2069,7 @@
         </w:tc>
         <w:tc>
           <w:tcPr>
-            <w:tcW w:type="dxa" w:w="3312"/>
+            <w:tcW w:type="dxa" w:w="2592"/>
             <w:vAlign w:val="center"/>
             <w:shd w:val="clear" w:color="auto" w:fill="870F73"/>
           </w:tcPr>
@@ -2041,13 +2093,13 @@
       <w:tr>
         <w:tc>
           <w:tcPr>
-            <w:tcW w:type="dxa" w:w="1872"/>
+            <w:tcW w:type="dxa" w:w="1008"/>
             <w:vAlign w:val="center"/>
           </w:tcPr>
           <w:p>
             <w:pPr>
               <w:spacing w:after="40" w:before="40"/>
-              <w:jc w:val="left"/>
+              <w:jc w:val="center"/>
             </w:pPr>
             <w:r>
               <w:rPr>
@@ -2056,17 +2108,13 @@
                 <w:color w:val="333333"/>
                 <w:sz w:val="16"/>
               </w:rPr>
-              <w:t>Phase 1</w:t>
-              <w:br/>
-              <w:t>Foundation</w:t>
-              <w:br/>
-              <w:t>Weeks 1–2</w:t>
+              <w:t>Day 1</w:t>
             </w:r>
           </w:p>
         </w:tc>
         <w:tc>
           <w:tcPr>
-            <w:tcW w:type="dxa" w:w="4320"/>
+            <w:tcW w:type="dxa" w:w="1872"/>
             <w:vAlign w:val="center"/>
           </w:tcPr>
           <w:p>
@@ -2080,13 +2128,13 @@
                 <w:color w:val="333333"/>
                 <w:sz w:val="16"/>
               </w:rPr>
-              <w:t>Repo hygiene, design tokens, shared layout (header/sidebar), API client hardening, auth + KYC shell, error/loading states</w:t>
+              <w:t>Auth &amp; KYC</w:t>
             </w:r>
           </w:p>
         </w:tc>
         <w:tc>
           <w:tcPr>
-            <w:tcW w:type="dxa" w:w="3312"/>
+            <w:tcW w:type="dxa" w:w="4032"/>
             <w:vAlign w:val="center"/>
           </w:tcPr>
           <w:p>
@@ -2100,12 +2148,53 @@
                 <w:color w:val="333333"/>
                 <w:sz w:val="16"/>
               </w:rPr>
-              <w:t>Demo: Auth E2E works against mock → real API toggle</w:t>
+              <w:t>Signup/login/OTP/JWT, profile, document upload (ID, selfie, proof), /profile/kyc — wire auth/* pages</w:t>
+            </w:r>
+          </w:p>
+        </w:tc>
+        <w:tc>
+          <w:tcPr>
+            <w:tcW w:type="dxa" w:w="2592"/>
+            <w:vAlign w:val="center"/>
+          </w:tcPr>
+          <w:p>
+            <w:pPr>
+              <w:spacing w:after="40" w:before="40"/>
+              <w:jc w:val="left"/>
+            </w:pPr>
+            <w:r>
+              <w:rPr>
+                <w:rFonts w:ascii="Calibri" w:hAnsi="Calibri"/>
+                <w:color w:val="333333"/>
+                <w:sz w:val="16"/>
+              </w:rPr>
+              <w:t>Auth E2E passes (OTP → profile)</w:t>
             </w:r>
           </w:p>
         </w:tc>
       </w:tr>
       <w:tr>
+        <w:tc>
+          <w:tcPr>
+            <w:tcW w:type="dxa" w:w="1008"/>
+            <w:vAlign w:val="center"/>
+          </w:tcPr>
+          <w:p>
+            <w:pPr>
+              <w:spacing w:after="40" w:before="40"/>
+              <w:jc w:val="center"/>
+            </w:pPr>
+            <w:r>
+              <w:rPr>
+                <w:rFonts w:ascii="Calibri" w:hAnsi="Calibri"/>
+                <w:b/>
+                <w:color w:val="333333"/>
+                <w:sz w:val="16"/>
+              </w:rPr>
+              <w:t>Day 2</w:t>
+            </w:r>
+          </w:p>
+        </w:tc>
         <w:tc>
           <w:tcPr>
             <w:tcW w:type="dxa" w:w="1872"/>
@@ -2119,21 +2208,16 @@
             <w:r>
               <w:rPr>
                 <w:rFonts w:ascii="Calibri" w:hAnsi="Calibri"/>
-                <w:b/>
                 <w:color w:val="333333"/>
                 <w:sz w:val="16"/>
               </w:rPr>
-              <w:t>Phase 2</w:t>
-              <w:br/>
-              <w:t>Core Investment</w:t>
-              <w:br/>
-              <w:t>Weeks 3–5</w:t>
+              <w:t>Properties &amp; Marketplace</w:t>
             </w:r>
           </w:p>
         </w:tc>
         <w:tc>
           <w:tcPr>
-            <w:tcW w:type="dxa" w:w="4320"/>
+            <w:tcW w:type="dxa" w:w="4032"/>
             <w:vAlign w:val="center"/>
           </w:tcPr>
           <w:p>
@@ -2147,13 +2231,13 @@
                 <w:color w:val="333333"/>
                 <w:sz w:val="16"/>
               </w:rPr>
-              <w:t>Marketplace, asset detail, checkout + success, portfolio/dashboard, wallet, dividends, referrals</w:t>
+              <w:t>Assets CRUD, funding progress %, milestones, search/filters (location/type/status) — wire marketplace + assets/[id]</w:t>
             </w:r>
           </w:p>
         </w:tc>
         <w:tc>
           <w:tcPr>
-            <w:tcW w:type="dxa" w:w="3312"/>
+            <w:tcW w:type="dxa" w:w="2592"/>
             <w:vAlign w:val="center"/>
           </w:tcPr>
           <w:p>
@@ -2167,12 +2251,33 @@
                 <w:color w:val="333333"/>
                 <w:sz w:val="16"/>
               </w:rPr>
-              <w:t>Demo: Investor can invest N500k and see holding + projected returns</w:t>
+              <w:t>Marketplace &amp; asset detail against real API</w:t>
             </w:r>
           </w:p>
         </w:tc>
       </w:tr>
       <w:tr>
+        <w:tc>
+          <w:tcPr>
+            <w:tcW w:type="dxa" w:w="1008"/>
+            <w:vAlign w:val="center"/>
+          </w:tcPr>
+          <w:p>
+            <w:pPr>
+              <w:spacing w:after="40" w:before="40"/>
+              <w:jc w:val="center"/>
+            </w:pPr>
+            <w:r>
+              <w:rPr>
+                <w:rFonts w:ascii="Calibri" w:hAnsi="Calibri"/>
+                <w:b/>
+                <w:color w:val="333333"/>
+                <w:sz w:val="16"/>
+              </w:rPr>
+              <w:t>Day 3</w:t>
+            </w:r>
+          </w:p>
+        </w:tc>
         <w:tc>
           <w:tcPr>
             <w:tcW w:type="dxa" w:w="1872"/>
@@ -2186,21 +2291,16 @@
             <w:r>
               <w:rPr>
                 <w:rFonts w:ascii="Calibri" w:hAnsi="Calibri"/>
-                <w:b/>
                 <w:color w:val="333333"/>
                 <w:sz w:val="16"/>
               </w:rPr>
-              <w:t>Phase 3</w:t>
-              <w:br/>
-              <w:t>Trust &amp; Compliance</w:t>
-              <w:br/>
-              <w:t>Weeks 6–7</w:t>
+              <w:t>Investments &amp; Trustee</w:t>
             </w:r>
           </w:p>
         </w:tc>
         <w:tc>
           <w:tcPr>
-            <w:tcW w:type="dxa" w:w="4320"/>
+            <w:tcW w:type="dxa" w:w="4032"/>
             <w:vAlign w:val="center"/>
           </w:tcPr>
           <w:p>
@@ -2214,13 +2314,13 @@
                 <w:color w:val="333333"/>
                 <w:sz w:val="16"/>
               </w:rPr>
-              <w:t>Trustee explainer throughout UI, legal/title docs, rate limiting, security headers QA, copy freeze (hero, How It Works, Why Urbco)</w:t>
+              <w:t>Allocate ₦10M–₦100M+ (single lump), status Held by Trustees, milestone verify → release — wire checkout</w:t>
             </w:r>
           </w:p>
         </w:tc>
         <w:tc>
           <w:tcPr>
-            <w:tcW w:type="dxa" w:w="3312"/>
+            <w:tcW w:type="dxa" w:w="2592"/>
             <w:vAlign w:val="center"/>
           </w:tcPr>
           <w:p>
@@ -2234,12 +2334,33 @@
                 <w:color w:val="333333"/>
                 <w:sz w:val="16"/>
               </w:rPr>
-              <w:t>CEO copy &amp; compliance sign-off</w:t>
+              <w:t>Large allocation E2E → wallet shows held</w:t>
             </w:r>
           </w:p>
         </w:tc>
       </w:tr>
       <w:tr>
+        <w:tc>
+          <w:tcPr>
+            <w:tcW w:type="dxa" w:w="1008"/>
+            <w:vAlign w:val="center"/>
+          </w:tcPr>
+          <w:p>
+            <w:pPr>
+              <w:spacing w:after="40" w:before="40"/>
+              <w:jc w:val="center"/>
+            </w:pPr>
+            <w:r>
+              <w:rPr>
+                <w:rFonts w:ascii="Calibri" w:hAnsi="Calibri"/>
+                <w:b/>
+                <w:color w:val="333333"/>
+                <w:sz w:val="16"/>
+              </w:rPr>
+              <w:t>Day 4</w:t>
+            </w:r>
+          </w:p>
+        </w:tc>
         <w:tc>
           <w:tcPr>
             <w:tcW w:type="dxa" w:w="1872"/>
@@ -2253,21 +2374,16 @@
             <w:r>
               <w:rPr>
                 <w:rFonts w:ascii="Calibri" w:hAnsi="Calibri"/>
-                <w:b/>
                 <w:color w:val="333333"/>
                 <w:sz w:val="16"/>
               </w:rPr>
-              <w:t>Phase 4</w:t>
-              <w:br/>
-              <w:t>Hardening &amp; Launch</w:t>
-              <w:br/>
-              <w:t>Weeks 8–10</w:t>
+              <w:t>Wallet, Dividends &amp; Referrals</w:t>
             </w:r>
           </w:p>
         </w:tc>
         <w:tc>
           <w:tcPr>
-            <w:tcW w:type="dxa" w:w="4320"/>
+            <w:tcW w:type="dxa" w:w="4032"/>
             <w:vAlign w:val="center"/>
           </w:tcPr>
           <w:p>
@@ -2281,13 +2397,13 @@
                 <w:color w:val="333333"/>
                 <w:sz w:val="16"/>
               </w:rPr>
-              <w:t>Performance (LCP, bundle), SEO, analytics, full E2E + UAT, staging → production cutover, rollback drill</w:t>
+              <w:t>Quarterly dividends to wallet, transactions, balance, referrals — wire wallet/dividends/referrals</w:t>
             </w:r>
           </w:p>
         </w:tc>
         <w:tc>
           <w:tcPr>
-            <w:tcW w:type="dxa" w:w="3312"/>
+            <w:tcW w:type="dxa" w:w="2592"/>
             <w:vAlign w:val="center"/>
           </w:tcPr>
           <w:p>
@@ -2301,7 +2417,256 @@
                 <w:color w:val="333333"/>
                 <w:sz w:val="16"/>
               </w:rPr>
-              <w:t>Launch checklist green; prod smoke test passes</w:t>
+              <w:t>Dividends land in wallet on schedule</w:t>
+            </w:r>
+          </w:p>
+        </w:tc>
+      </w:tr>
+      <w:tr>
+        <w:tc>
+          <w:tcPr>
+            <w:tcW w:type="dxa" w:w="1008"/>
+            <w:vAlign w:val="center"/>
+          </w:tcPr>
+          <w:p>
+            <w:pPr>
+              <w:spacing w:after="40" w:before="40"/>
+              <w:jc w:val="center"/>
+            </w:pPr>
+            <w:r>
+              <w:rPr>
+                <w:rFonts w:ascii="Calibri" w:hAnsi="Calibri"/>
+                <w:b/>
+                <w:color w:val="333333"/>
+                <w:sz w:val="16"/>
+              </w:rPr>
+              <w:t>Day 5</w:t>
+            </w:r>
+          </w:p>
+        </w:tc>
+        <w:tc>
+          <w:tcPr>
+            <w:tcW w:type="dxa" w:w="1872"/>
+            <w:vAlign w:val="center"/>
+          </w:tcPr>
+          <w:p>
+            <w:pPr>
+              <w:spacing w:after="40" w:before="40"/>
+              <w:jc w:val="left"/>
+            </w:pPr>
+            <w:r>
+              <w:rPr>
+                <w:rFonts w:ascii="Calibri" w:hAnsi="Calibri"/>
+                <w:color w:val="333333"/>
+                <w:sz w:val="16"/>
+              </w:rPr>
+              <w:t>Portfolio, Dashboard &amp; Notifications</w:t>
+            </w:r>
+          </w:p>
+        </w:tc>
+        <w:tc>
+          <w:tcPr>
+            <w:tcW w:type="dxa" w:w="4032"/>
+            <w:vAlign w:val="center"/>
+          </w:tcPr>
+          <w:p>
+            <w:pPr>
+              <w:spacing w:after="40" w:before="40"/>
+              <w:jc w:val="left"/>
+            </w:pPr>
+            <w:r>
+              <w:rPr>
+                <w:rFonts w:ascii="Calibri" w:hAnsi="Calibri"/>
+                <w:color w:val="333333"/>
+                <w:sz w:val="16"/>
+              </w:rPr>
+              <w:t>Holdings, live valuation, growth/alloc charts, notifications, settings — wire portfolio/dashboard</w:t>
+            </w:r>
+          </w:p>
+        </w:tc>
+        <w:tc>
+          <w:tcPr>
+            <w:tcW w:type="dxa" w:w="2592"/>
+            <w:vAlign w:val="center"/>
+          </w:tcPr>
+          <w:p>
+            <w:pPr>
+              <w:spacing w:after="40" w:before="40"/>
+              <w:jc w:val="left"/>
+            </w:pPr>
+            <w:r>
+              <w:rPr>
+                <w:rFonts w:ascii="Calibri" w:hAnsi="Calibri"/>
+                <w:color w:val="333333"/>
+                <w:sz w:val="16"/>
+              </w:rPr>
+              <w:t>Portfolio shows term ROI live</w:t>
+            </w:r>
+          </w:p>
+        </w:tc>
+      </w:tr>
+      <w:tr>
+        <w:tc>
+          <w:tcPr>
+            <w:tcW w:type="dxa" w:w="1008"/>
+            <w:vAlign w:val="center"/>
+          </w:tcPr>
+          <w:p>
+            <w:pPr>
+              <w:spacing w:after="40" w:before="40"/>
+              <w:jc w:val="center"/>
+            </w:pPr>
+            <w:r>
+              <w:rPr>
+                <w:rFonts w:ascii="Calibri" w:hAnsi="Calibri"/>
+                <w:b/>
+                <w:color w:val="333333"/>
+                <w:sz w:val="16"/>
+              </w:rPr>
+              <w:t>Day 6</w:t>
+            </w:r>
+          </w:p>
+        </w:tc>
+        <w:tc>
+          <w:tcPr>
+            <w:tcW w:type="dxa" w:w="1872"/>
+            <w:vAlign w:val="center"/>
+          </w:tcPr>
+          <w:p>
+            <w:pPr>
+              <w:spacing w:after="40" w:before="40"/>
+              <w:jc w:val="left"/>
+            </w:pPr>
+            <w:r>
+              <w:rPr>
+                <w:rFonts w:ascii="Calibri" w:hAnsi="Calibri"/>
+                <w:color w:val="333333"/>
+                <w:sz w:val="16"/>
+              </w:rPr>
+              <w:t>Integration</w:t>
+            </w:r>
+          </w:p>
+        </w:tc>
+        <w:tc>
+          <w:tcPr>
+            <w:tcW w:type="dxa" w:w="4032"/>
+            <w:vAlign w:val="center"/>
+          </w:tcPr>
+          <w:p>
+            <w:pPr>
+              <w:spacing w:after="40" w:before="40"/>
+              <w:jc w:val="left"/>
+            </w:pPr>
+            <w:r>
+              <w:rPr>
+                <w:rFonts w:ascii="Calibri" w:hAnsi="Calibri"/>
+                <w:color w:val="333333"/>
+                <w:sz w:val="16"/>
+              </w:rPr>
+              <w:t>Replace src/data/mockData.ts with live API across ALL confirmed sides; payments, email/OTP, storage; error/loading states</w:t>
+            </w:r>
+          </w:p>
+        </w:tc>
+        <w:tc>
+          <w:tcPr>
+            <w:tcW w:type="dxa" w:w="2592"/>
+            <w:vAlign w:val="center"/>
+          </w:tcPr>
+          <w:p>
+            <w:pPr>
+              <w:spacing w:after="40" w:before="40"/>
+              <w:jc w:val="left"/>
+            </w:pPr>
+            <w:r>
+              <w:rPr>
+                <w:rFonts w:ascii="Calibri" w:hAnsi="Calibri"/>
+                <w:color w:val="333333"/>
+                <w:sz w:val="16"/>
+              </w:rPr>
+              <w:t>Full click-through all 19 sides, no mocks</w:t>
+            </w:r>
+          </w:p>
+        </w:tc>
+      </w:tr>
+      <w:tr>
+        <w:tc>
+          <w:tcPr>
+            <w:tcW w:type="dxa" w:w="1008"/>
+            <w:vAlign w:val="center"/>
+          </w:tcPr>
+          <w:p>
+            <w:pPr>
+              <w:spacing w:after="40" w:before="40"/>
+              <w:jc w:val="center"/>
+            </w:pPr>
+            <w:r>
+              <w:rPr>
+                <w:rFonts w:ascii="Calibri" w:hAnsi="Calibri"/>
+                <w:b/>
+                <w:color w:val="333333"/>
+                <w:sz w:val="16"/>
+              </w:rPr>
+              <w:t>Day 7</w:t>
+            </w:r>
+          </w:p>
+        </w:tc>
+        <w:tc>
+          <w:tcPr>
+            <w:tcW w:type="dxa" w:w="1872"/>
+            <w:vAlign w:val="center"/>
+          </w:tcPr>
+          <w:p>
+            <w:pPr>
+              <w:spacing w:after="40" w:before="40"/>
+              <w:jc w:val="left"/>
+            </w:pPr>
+            <w:r>
+              <w:rPr>
+                <w:rFonts w:ascii="Calibri" w:hAnsi="Calibri"/>
+                <w:color w:val="333333"/>
+                <w:sz w:val="16"/>
+              </w:rPr>
+              <w:t>Testing &amp; Launch</w:t>
+            </w:r>
+          </w:p>
+        </w:tc>
+        <w:tc>
+          <w:tcPr>
+            <w:tcW w:type="dxa" w:w="4032"/>
+            <w:vAlign w:val="center"/>
+          </w:tcPr>
+          <w:p>
+            <w:pPr>
+              <w:spacing w:after="40" w:before="40"/>
+              <w:jc w:val="left"/>
+            </w:pPr>
+            <w:r>
+              <w:rPr>
+                <w:rFonts w:ascii="Calibri" w:hAnsi="Calibri"/>
+                <w:color w:val="333333"/>
+                <w:sz w:val="16"/>
+              </w:rPr>
+              <w:t>Unit+integration+E2E (Playwright), security (audit+headers), Lighthouse, UAT with CEO + 2 high-value personas, prod deploy</w:t>
+            </w:r>
+          </w:p>
+        </w:tc>
+        <w:tc>
+          <w:tcPr>
+            <w:tcW w:type="dxa" w:w="2592"/>
+            <w:vAlign w:val="center"/>
+          </w:tcPr>
+          <w:p>
+            <w:pPr>
+              <w:spacing w:after="40" w:before="40"/>
+              <w:jc w:val="left"/>
+            </w:pPr>
+            <w:r>
+              <w:rPr>
+                <w:rFonts w:ascii="Calibri" w:hAnsi="Calibri"/>
+                <w:color w:val="333333"/>
+                <w:sz w:val="16"/>
+              </w:rPr>
+              <w:t>Prod smoke test pass, rollback drill, launch</w:t>
             </w:r>
           </w:p>
         </w:tc>
@@ -2314,20 +2679,17 @@
     </w:p>
     <w:p>
       <w:pPr>
-        <w:pStyle w:val="Heading1"/>
-        <w:spacing w:before="280" w:after="120"/>
-        <w:pBdr>
-          <w:bottom w:val="single" w:sz="6" w:space="4" w:color="D4A065"/>
-        </w:pBdr>
+        <w:pStyle w:val="Heading2"/>
+        <w:spacing w:before="200" w:after="120"/>
       </w:pPr>
       <w:r>
         <w:rPr>
           <w:rFonts w:ascii="Calibri" w:hAnsi="Calibri"/>
           <w:b/>
-          <w:color w:val="870F73"/>
-          <w:sz w:val="36"/>
+          <w:color w:val="1E293B"/>
+          <w:sz w:val="22"/>
         </w:rPr>
-        <w:t>7  Milestones &amp; Timeline (10 Weeks)</w:t>
+        <w:t>Milestones in 7 days</w:t>
       </w:r>
     </w:p>
     <w:tbl>
@@ -2339,35 +2701,12 @@
         <w:tblLook w:firstColumn="1" w:firstRow="1" w:lastColumn="0" w:lastRow="0" w:noHBand="0" w:noVBand="1" w:val="04A0"/>
       </w:tblPr>
       <w:tblGrid>
-        <w:gridCol w:w="2045"/>
-        <w:gridCol w:w="2045"/>
-        <w:gridCol w:w="2045"/>
-        <w:gridCol w:w="2045"/>
-        <w:gridCol w:w="2045"/>
+        <w:gridCol w:w="2556"/>
+        <w:gridCol w:w="2556"/>
+        <w:gridCol w:w="2556"/>
+        <w:gridCol w:w="2556"/>
       </w:tblGrid>
       <w:tr>
-        <w:tc>
-          <w:tcPr>
-            <w:tcW w:type="dxa" w:w="1008"/>
-            <w:vAlign w:val="center"/>
-            <w:shd w:val="clear" w:color="auto" w:fill="870F73"/>
-          </w:tcPr>
-          <w:p>
-            <w:pPr>
-              <w:spacing w:after="40" w:before="40"/>
-              <w:jc w:val="center"/>
-            </w:pPr>
-            <w:r>
-              <w:rPr>
-                <w:rFonts w:ascii="Calibri" w:hAnsi="Calibri"/>
-                <w:b/>
-                <w:color w:val="FFFFFF"/>
-                <w:sz w:val="16"/>
-              </w:rPr>
-              <w:t>Milestone</w:t>
-            </w:r>
-          </w:p>
-        </w:tc>
         <w:tc>
           <w:tcPr>
             <w:tcW w:type="dxa" w:w="864"/>
@@ -2386,13 +2725,13 @@
                 <w:color w:val="FFFFFF"/>
                 <w:sz w:val="16"/>
               </w:rPr>
-              <w:t>When</w:t>
+              <w:t>Day</w:t>
             </w:r>
           </w:p>
         </w:tc>
         <w:tc>
           <w:tcPr>
-            <w:tcW w:type="dxa" w:w="2160"/>
+            <w:tcW w:type="dxa" w:w="2304"/>
             <w:vAlign w:val="center"/>
             <w:shd w:val="clear" w:color="auto" w:fill="870F73"/>
           </w:tcPr>
@@ -2414,7 +2753,7 @@
         </w:tc>
         <w:tc>
           <w:tcPr>
-            <w:tcW w:type="dxa" w:w="1440"/>
+            <w:tcW w:type="dxa" w:w="1728"/>
             <w:vAlign w:val="center"/>
             <w:shd w:val="clear" w:color="auto" w:fill="870F73"/>
           </w:tcPr>
@@ -2436,7 +2775,7 @@
         </w:tc>
         <w:tc>
           <w:tcPr>
-            <w:tcW w:type="dxa" w:w="4032"/>
+            <w:tcW w:type="dxa" w:w="4176"/>
             <w:vAlign w:val="center"/>
             <w:shd w:val="clear" w:color="auto" w:fill="870F73"/>
           </w:tcPr>
@@ -2452,7 +2791,7 @@
                 <w:color w:val="FFFFFF"/>
                 <w:sz w:val="16"/>
               </w:rPr>
-              <w:t>Exit Criteria</w:t>
+              <w:t>Exit</w:t>
             </w:r>
           </w:p>
         </w:tc>
@@ -2460,13 +2799,13 @@
       <w:tr>
         <w:tc>
           <w:tcPr>
-            <w:tcW w:type="dxa" w:w="1008"/>
+            <w:tcW w:type="dxa" w:w="864"/>
             <w:vAlign w:val="center"/>
           </w:tcPr>
           <w:p>
             <w:pPr>
               <w:spacing w:after="40" w:before="40"/>
-              <w:jc w:val="left"/>
+              <w:jc w:val="center"/>
             </w:pPr>
             <w:r>
               <w:rPr>
@@ -2475,13 +2814,13 @@
                 <w:color w:val="333333"/>
                 <w:sz w:val="16"/>
               </w:rPr>
-              <w:t>M1</w:t>
+              <w:t>D1</w:t>
             </w:r>
           </w:p>
         </w:tc>
         <w:tc>
           <w:tcPr>
-            <w:tcW w:type="dxa" w:w="864"/>
+            <w:tcW w:type="dxa" w:w="2304"/>
             <w:vAlign w:val="center"/>
           </w:tcPr>
           <w:p>
@@ -2495,33 +2834,13 @@
                 <w:color w:val="333333"/>
                 <w:sz w:val="16"/>
               </w:rPr>
-              <w:t>W2</w:t>
+              <w:t>Auth + KYC</w:t>
             </w:r>
           </w:p>
         </w:tc>
         <w:tc>
           <w:tcPr>
-            <w:tcW w:type="dxa" w:w="2160"/>
-            <w:vAlign w:val="center"/>
-          </w:tcPr>
-          <w:p>
-            <w:pPr>
-              <w:spacing w:after="40" w:before="40"/>
-              <w:jc w:val="left"/>
-            </w:pPr>
-            <w:r>
-              <w:rPr>
-                <w:rFonts w:ascii="Calibri" w:hAnsi="Calibri"/>
-                <w:color w:val="333333"/>
-                <w:sz w:val="16"/>
-              </w:rPr>
-              <w:t>Auth + Shell</w:t>
-            </w:r>
-          </w:p>
-        </w:tc>
-        <w:tc>
-          <w:tcPr>
-            <w:tcW w:type="dxa" w:w="1440"/>
+            <w:tcW w:type="dxa" w:w="1728"/>
             <w:vAlign w:val="center"/>
           </w:tcPr>
           <w:p>
@@ -2541,50 +2860,7 @@
         </w:tc>
         <w:tc>
           <w:tcPr>
-            <w:tcW w:type="dxa" w:w="4032"/>
-            <w:vAlign w:val="center"/>
-          </w:tcPr>
-          <w:p>
-            <w:pPr>
-              <w:spacing w:after="40" w:before="40"/>
-              <w:jc w:val="center"/>
-            </w:pPr>
-            <w:r>
-              <w:rPr>
-                <w:rFonts w:ascii="Calibri" w:hAnsi="Calibri"/>
-                <w:color w:val="333333"/>
-                <w:sz w:val="16"/>
-              </w:rPr>
-              <w:t>OTP, login/signup E2E passing; layout stable</w:t>
-            </w:r>
-          </w:p>
-        </w:tc>
-      </w:tr>
-      <w:tr>
-        <w:tc>
-          <w:tcPr>
-            <w:tcW w:type="dxa" w:w="1008"/>
-            <w:vAlign w:val="center"/>
-          </w:tcPr>
-          <w:p>
-            <w:pPr>
-              <w:spacing w:after="40" w:before="40"/>
-              <w:jc w:val="left"/>
-            </w:pPr>
-            <w:r>
-              <w:rPr>
-                <w:rFonts w:ascii="Calibri" w:hAnsi="Calibri"/>
-                <w:b/>
-                <w:color w:val="333333"/>
-                <w:sz w:val="16"/>
-              </w:rPr>
-              <w:t>M2</w:t>
-            </w:r>
-          </w:p>
-        </w:tc>
-        <w:tc>
-          <w:tcPr>
-            <w:tcW w:type="dxa" w:w="864"/>
+            <w:tcW w:type="dxa" w:w="4176"/>
             <w:vAlign w:val="center"/>
           </w:tcPr>
           <w:p>
@@ -2598,13 +2874,36 @@
                 <w:color w:val="333333"/>
                 <w:sz w:val="16"/>
               </w:rPr>
-              <w:t>W5</w:t>
+              <w:t>Login/signup/OTP E2E green</w:t>
+            </w:r>
+          </w:p>
+        </w:tc>
+      </w:tr>
+      <w:tr>
+        <w:tc>
+          <w:tcPr>
+            <w:tcW w:type="dxa" w:w="864"/>
+            <w:vAlign w:val="center"/>
+          </w:tcPr>
+          <w:p>
+            <w:pPr>
+              <w:spacing w:after="40" w:before="40"/>
+              <w:jc w:val="center"/>
+            </w:pPr>
+            <w:r>
+              <w:rPr>
+                <w:rFonts w:ascii="Calibri" w:hAnsi="Calibri"/>
+                <w:b/>
+                <w:color w:val="333333"/>
+                <w:sz w:val="16"/>
+              </w:rPr>
+              <w:t>D2</w:t>
             </w:r>
           </w:p>
         </w:tc>
         <w:tc>
           <w:tcPr>
-            <w:tcW w:type="dxa" w:w="2160"/>
+            <w:tcW w:type="dxa" w:w="2304"/>
             <w:vAlign w:val="center"/>
           </w:tcPr>
           <w:p>
@@ -2618,13 +2917,13 @@
                 <w:color w:val="333333"/>
                 <w:sz w:val="16"/>
               </w:rPr>
-              <w:t>Investment Loop</w:t>
+              <w:t>Marketplace Live</w:t>
             </w:r>
           </w:p>
         </w:tc>
         <w:tc>
           <w:tcPr>
-            <w:tcW w:type="dxa" w:w="1440"/>
+            <w:tcW w:type="dxa" w:w="1728"/>
             <w:vAlign w:val="center"/>
           </w:tcPr>
           <w:p>
@@ -2644,7 +2943,70 @@
         </w:tc>
         <w:tc>
           <w:tcPr>
-            <w:tcW w:type="dxa" w:w="4032"/>
+            <w:tcW w:type="dxa" w:w="4176"/>
+            <w:vAlign w:val="center"/>
+          </w:tcPr>
+          <w:p>
+            <w:pPr>
+              <w:spacing w:after="40" w:before="40"/>
+              <w:jc w:val="left"/>
+            </w:pPr>
+            <w:r>
+              <w:rPr>
+                <w:rFonts w:ascii="Calibri" w:hAnsi="Calibri"/>
+                <w:color w:val="333333"/>
+                <w:sz w:val="16"/>
+              </w:rPr>
+              <w:t>Real assets, funding progress accurate</w:t>
+            </w:r>
+          </w:p>
+        </w:tc>
+      </w:tr>
+      <w:tr>
+        <w:tc>
+          <w:tcPr>
+            <w:tcW w:type="dxa" w:w="864"/>
+            <w:vAlign w:val="center"/>
+          </w:tcPr>
+          <w:p>
+            <w:pPr>
+              <w:spacing w:after="40" w:before="40"/>
+              <w:jc w:val="center"/>
+            </w:pPr>
+            <w:r>
+              <w:rPr>
+                <w:rFonts w:ascii="Calibri" w:hAnsi="Calibri"/>
+                <w:b/>
+                <w:color w:val="333333"/>
+                <w:sz w:val="16"/>
+              </w:rPr>
+              <w:t>D3</w:t>
+            </w:r>
+          </w:p>
+        </w:tc>
+        <w:tc>
+          <w:tcPr>
+            <w:tcW w:type="dxa" w:w="2304"/>
+            <w:vAlign w:val="center"/>
+          </w:tcPr>
+          <w:p>
+            <w:pPr>
+              <w:spacing w:after="40" w:before="40"/>
+              <w:jc w:val="left"/>
+            </w:pPr>
+            <w:r>
+              <w:rPr>
+                <w:rFonts w:ascii="Calibri" w:hAnsi="Calibri"/>
+                <w:color w:val="333333"/>
+                <w:sz w:val="16"/>
+              </w:rPr>
+              <w:t>Trustee Flow</w:t>
+            </w:r>
+          </w:p>
+        </w:tc>
+        <w:tc>
+          <w:tcPr>
+            <w:tcW w:type="dxa" w:w="1728"/>
             <w:vAlign w:val="center"/>
           </w:tcPr>
           <w:p>
@@ -2658,36 +3020,13 @@
                 <w:color w:val="333333"/>
                 <w:sz w:val="16"/>
               </w:rPr>
-              <w:t>Marketplace → Checkout → Portfolio against real API</w:t>
-            </w:r>
-          </w:p>
-        </w:tc>
-      </w:tr>
-      <w:tr>
-        <w:tc>
-          <w:tcPr>
-            <w:tcW w:type="dxa" w:w="1008"/>
-            <w:vAlign w:val="center"/>
-          </w:tcPr>
-          <w:p>
-            <w:pPr>
-              <w:spacing w:after="40" w:before="40"/>
-              <w:jc w:val="left"/>
-            </w:pPr>
-            <w:r>
-              <w:rPr>
-                <w:rFonts w:ascii="Calibri" w:hAnsi="Calibri"/>
-                <w:b/>
-                <w:color w:val="333333"/>
-                <w:sz w:val="16"/>
-              </w:rPr>
-              <w:t>M3</w:t>
+              <w:t>Dev + CEO</w:t>
             </w:r>
           </w:p>
         </w:tc>
         <w:tc>
           <w:tcPr>
-            <w:tcW w:type="dxa" w:w="864"/>
+            <w:tcW w:type="dxa" w:w="4176"/>
             <w:vAlign w:val="center"/>
           </w:tcPr>
           <w:p>
@@ -2701,13 +3040,36 @@
                 <w:color w:val="333333"/>
                 <w:sz w:val="16"/>
               </w:rPr>
-              <w:t>W7</w:t>
+              <w:t>CEO confirms milestone triggers (e.g., foundation, roofing)</w:t>
+            </w:r>
+          </w:p>
+        </w:tc>
+      </w:tr>
+      <w:tr>
+        <w:tc>
+          <w:tcPr>
+            <w:tcW w:type="dxa" w:w="864"/>
+            <w:vAlign w:val="center"/>
+          </w:tcPr>
+          <w:p>
+            <w:pPr>
+              <w:spacing w:after="40" w:before="40"/>
+              <w:jc w:val="center"/>
+            </w:pPr>
+            <w:r>
+              <w:rPr>
+                <w:rFonts w:ascii="Calibri" w:hAnsi="Calibri"/>
+                <w:b/>
+                <w:color w:val="333333"/>
+                <w:sz w:val="16"/>
+              </w:rPr>
+              <w:t>D4</w:t>
             </w:r>
           </w:p>
         </w:tc>
         <w:tc>
           <w:tcPr>
-            <w:tcW w:type="dxa" w:w="2160"/>
+            <w:tcW w:type="dxa" w:w="2304"/>
             <w:vAlign w:val="center"/>
           </w:tcPr>
           <w:p>
@@ -2721,13 +3083,13 @@
                 <w:color w:val="333333"/>
                 <w:sz w:val="16"/>
               </w:rPr>
-              <w:t>Trustee Narrative Live</w:t>
+              <w:t>Dividends in App</w:t>
             </w:r>
           </w:p>
         </w:tc>
         <w:tc>
           <w:tcPr>
-            <w:tcW w:type="dxa" w:w="1440"/>
+            <w:tcW w:type="dxa" w:w="1728"/>
             <w:vAlign w:val="center"/>
           </w:tcPr>
           <w:p>
@@ -2741,13 +3103,76 @@
                 <w:color w:val="333333"/>
                 <w:sz w:val="16"/>
               </w:rPr>
-              <w:t>CEO + Dev</w:t>
+              <w:t>Dev</w:t>
             </w:r>
           </w:p>
         </w:tc>
         <w:tc>
           <w:tcPr>
-            <w:tcW w:type="dxa" w:w="4032"/>
+            <w:tcW w:type="dxa" w:w="4176"/>
+            <w:vAlign w:val="center"/>
+          </w:tcPr>
+          <w:p>
+            <w:pPr>
+              <w:spacing w:after="40" w:before="40"/>
+              <w:jc w:val="left"/>
+            </w:pPr>
+            <w:r>
+              <w:rPr>
+                <w:rFonts w:ascii="Calibri" w:hAnsi="Calibri"/>
+                <w:color w:val="333333"/>
+                <w:sz w:val="16"/>
+              </w:rPr>
+              <w:t>Wallet &amp; dividends E2E passes</w:t>
+            </w:r>
+          </w:p>
+        </w:tc>
+      </w:tr>
+      <w:tr>
+        <w:tc>
+          <w:tcPr>
+            <w:tcW w:type="dxa" w:w="864"/>
+            <w:vAlign w:val="center"/>
+          </w:tcPr>
+          <w:p>
+            <w:pPr>
+              <w:spacing w:after="40" w:before="40"/>
+              <w:jc w:val="center"/>
+            </w:pPr>
+            <w:r>
+              <w:rPr>
+                <w:rFonts w:ascii="Calibri" w:hAnsi="Calibri"/>
+                <w:b/>
+                <w:color w:val="333333"/>
+                <w:sz w:val="16"/>
+              </w:rPr>
+              <w:t>D5</w:t>
+            </w:r>
+          </w:p>
+        </w:tc>
+        <w:tc>
+          <w:tcPr>
+            <w:tcW w:type="dxa" w:w="2304"/>
+            <w:vAlign w:val="center"/>
+          </w:tcPr>
+          <w:p>
+            <w:pPr>
+              <w:spacing w:after="40" w:before="40"/>
+              <w:jc w:val="left"/>
+            </w:pPr>
+            <w:r>
+              <w:rPr>
+                <w:rFonts w:ascii="Calibri" w:hAnsi="Calibri"/>
+                <w:color w:val="333333"/>
+                <w:sz w:val="16"/>
+              </w:rPr>
+              <w:t>Portfolio Live</w:t>
+            </w:r>
+          </w:p>
+        </w:tc>
+        <w:tc>
+          <w:tcPr>
+            <w:tcW w:type="dxa" w:w="1728"/>
             <w:vAlign w:val="center"/>
           </w:tcPr>
           <w:p>
@@ -2761,36 +3186,13 @@
                 <w:color w:val="333333"/>
                 <w:sz w:val="16"/>
               </w:rPr>
-              <w:t>Hero/how-it-works/features/testimonials copy approved</w:t>
-            </w:r>
-          </w:p>
-        </w:tc>
-      </w:tr>
-      <w:tr>
-        <w:tc>
-          <w:tcPr>
-            <w:tcW w:type="dxa" w:w="1008"/>
-            <w:vAlign w:val="center"/>
-          </w:tcPr>
-          <w:p>
-            <w:pPr>
-              <w:spacing w:after="40" w:before="40"/>
-              <w:jc w:val="left"/>
-            </w:pPr>
-            <w:r>
-              <w:rPr>
-                <w:rFonts w:ascii="Calibri" w:hAnsi="Calibri"/>
-                <w:b/>
-                <w:color w:val="333333"/>
-                <w:sz w:val="16"/>
-              </w:rPr>
-              <w:t>M4</w:t>
+              <w:t>Dev</w:t>
             </w:r>
           </w:p>
         </w:tc>
         <w:tc>
           <w:tcPr>
-            <w:tcW w:type="dxa" w:w="864"/>
+            <w:tcW w:type="dxa" w:w="4176"/>
             <w:vAlign w:val="center"/>
           </w:tcPr>
           <w:p>
@@ -2804,13 +3206,36 @@
                 <w:color w:val="333333"/>
                 <w:sz w:val="16"/>
               </w:rPr>
-              <w:t>W8</w:t>
+              <w:t>Term ROI visible in portfolio/dashboard</w:t>
+            </w:r>
+          </w:p>
+        </w:tc>
+      </w:tr>
+      <w:tr>
+        <w:tc>
+          <w:tcPr>
+            <w:tcW w:type="dxa" w:w="864"/>
+            <w:vAlign w:val="center"/>
+          </w:tcPr>
+          <w:p>
+            <w:pPr>
+              <w:spacing w:after="40" w:before="40"/>
+              <w:jc w:val="center"/>
+            </w:pPr>
+            <w:r>
+              <w:rPr>
+                <w:rFonts w:ascii="Calibri" w:hAnsi="Calibri"/>
+                <w:b/>
+                <w:color w:val="333333"/>
+                <w:sz w:val="16"/>
+              </w:rPr>
+              <w:t>D6</w:t>
             </w:r>
           </w:p>
         </w:tc>
         <w:tc>
           <w:tcPr>
-            <w:tcW w:type="dxa" w:w="2160"/>
+            <w:tcW w:type="dxa" w:w="2304"/>
             <w:vAlign w:val="center"/>
           </w:tcPr>
           <w:p>
@@ -2824,13 +3249,13 @@
                 <w:color w:val="333333"/>
                 <w:sz w:val="16"/>
               </w:rPr>
-              <w:t>Test Suite Green</w:t>
+              <w:t>All Sides Wired</w:t>
             </w:r>
           </w:p>
         </w:tc>
         <w:tc>
           <w:tcPr>
-            <w:tcW w:type="dxa" w:w="1440"/>
+            <w:tcW w:type="dxa" w:w="1728"/>
             <w:vAlign w:val="center"/>
           </w:tcPr>
           <w:p>
@@ -2844,56 +3269,13 @@
                 <w:color w:val="333333"/>
                 <w:sz w:val="16"/>
               </w:rPr>
-              <w:t>QA</w:t>
+              <w:t>Dev</w:t>
             </w:r>
           </w:p>
         </w:tc>
         <w:tc>
           <w:tcPr>
-            <w:tcW w:type="dxa" w:w="4032"/>
-            <w:vAlign w:val="center"/>
-          </w:tcPr>
-          <w:p>
-            <w:pPr>
-              <w:spacing w:after="40" w:before="40"/>
-              <w:jc w:val="center"/>
-            </w:pPr>
-            <w:r>
-              <w:rPr>
-                <w:rFonts w:ascii="Calibri" w:hAnsi="Calibri"/>
-                <w:color w:val="333333"/>
-                <w:sz w:val="16"/>
-              </w:rPr>
-              <w:t>Coverage &gt;70%, 0 P0/P1 bugs, Lighthouse ≥90</w:t>
-            </w:r>
-          </w:p>
-        </w:tc>
-      </w:tr>
-      <w:tr>
-        <w:tc>
-          <w:tcPr>
-            <w:tcW w:type="dxa" w:w="1008"/>
-            <w:vAlign w:val="center"/>
-          </w:tcPr>
-          <w:p>
-            <w:pPr>
-              <w:spacing w:after="40" w:before="40"/>
-              <w:jc w:val="left"/>
-            </w:pPr>
-            <w:r>
-              <w:rPr>
-                <w:rFonts w:ascii="Calibri" w:hAnsi="Calibri"/>
-                <w:b/>
-                <w:color w:val="333333"/>
-                <w:sz w:val="16"/>
-              </w:rPr>
-              <w:t>M5</w:t>
-            </w:r>
-          </w:p>
-        </w:tc>
-        <w:tc>
-          <w:tcPr>
-            <w:tcW w:type="dxa" w:w="864"/>
+            <w:tcW w:type="dxa" w:w="4176"/>
             <w:vAlign w:val="center"/>
           </w:tcPr>
           <w:p>
@@ -2907,13 +3289,36 @@
                 <w:color w:val="333333"/>
                 <w:sz w:val="16"/>
               </w:rPr>
-              <w:t>W10</w:t>
+              <w:t>No mockData; full integration across 19 sides</w:t>
+            </w:r>
+          </w:p>
+        </w:tc>
+      </w:tr>
+      <w:tr>
+        <w:tc>
+          <w:tcPr>
+            <w:tcW w:type="dxa" w:w="864"/>
+            <w:vAlign w:val="center"/>
+          </w:tcPr>
+          <w:p>
+            <w:pPr>
+              <w:spacing w:after="40" w:before="40"/>
+              <w:jc w:val="center"/>
+            </w:pPr>
+            <w:r>
+              <w:rPr>
+                <w:rFonts w:ascii="Calibri" w:hAnsi="Calibri"/>
+                <w:b/>
+                <w:color w:val="333333"/>
+                <w:sz w:val="16"/>
+              </w:rPr>
+              <w:t>D7</w:t>
             </w:r>
           </w:p>
         </w:tc>
         <w:tc>
           <w:tcPr>
-            <w:tcW w:type="dxa" w:w="2160"/>
+            <w:tcW w:type="dxa" w:w="2304"/>
             <w:vAlign w:val="center"/>
           </w:tcPr>
           <w:p>
@@ -2933,7 +3338,7 @@
         </w:tc>
         <w:tc>
           <w:tcPr>
-            <w:tcW w:type="dxa" w:w="1440"/>
+            <w:tcW w:type="dxa" w:w="1728"/>
             <w:vAlign w:val="center"/>
           </w:tcPr>
           <w:p>
@@ -2953,13 +3358,13 @@
         </w:tc>
         <w:tc>
           <w:tcPr>
-            <w:tcW w:type="dxa" w:w="4032"/>
+            <w:tcW w:type="dxa" w:w="4176"/>
             <w:vAlign w:val="center"/>
           </w:tcPr>
           <w:p>
             <w:pPr>
               <w:spacing w:after="40" w:before="40"/>
-              <w:jc w:val="center"/>
+              <w:jc w:val="left"/>
             </w:pPr>
             <w:r>
               <w:rPr>
@@ -2967,7 +3372,7 @@
                 <w:color w:val="333333"/>
                 <w:sz w:val="16"/>
               </w:rPr>
-              <w:t>Vercel prod deploy verified, smoke test OK, rollback tested</w:t>
+              <w:t>Vercel prod verified, UAT signed</w:t>
             </w:r>
           </w:p>
         </w:tc>
@@ -2979,16 +3384,13 @@
       </w:pPr>
     </w:p>
     <w:p>
-      <w:pPr>
-        <w:jc w:val="left"/>
-      </w:pPr>
       <w:r>
         <w:rPr>
           <w:b/>
           <w:color w:val="475569"/>
           <w:sz w:val="16"/>
         </w:rPr>
-        <w:t xml:space="preserve">Note:  </w:t>
+        <w:t xml:space="preserve">Note: </w:t>
       </w:r>
       <w:r>
         <w:rPr>
@@ -2996,7 +3398,7 @@
           <w:color w:val="475569"/>
           <w:sz w:val="16"/>
         </w:rPr>
-        <w:t>Dates shift if trustee API contract changes. Keep weekly demos to catch drift early.</w:t>
+        <w:t>If trustee API needs change, keep mock fallback + feature flag — frontend stays frozen, so backend can keep pace.</w:t>
       </w:r>
     </w:p>
     <w:p>
@@ -3014,7 +3416,7 @@
           <w:color w:val="870F73"/>
           <w:sz w:val="36"/>
         </w:rPr>
-        <w:t>8  Development Workflow</w:t>
+        <w:t>7  Development Workflow (Frontend Frozen)</w:t>
       </w:r>
     </w:p>
     <w:p>
@@ -3029,7 +3431,7 @@
           <w:color w:val="1E293B"/>
           <w:sz w:val="18"/>
         </w:rPr>
-        <w:t>Branching &amp; PRs</w:t>
+        <w:t>Branching</w:t>
       </w:r>
     </w:p>
     <w:p>
@@ -3044,7 +3446,7 @@
           <w:color w:val="333333"/>
           <w:sz w:val="18"/>
         </w:rPr>
-        <w:t>main is production (Vercel auto-deploys). Feature branches feat/* → PR → 1 approval (CEO for copy/UX, Dev for code) → squash merge. No direct pushes to main.</w:t>
+        <w:t>main is production (Vercel auto-deploys). Backend work in feat/backend-* → PR → 1 approval → squash merge. No direct push to main. Frontend pages not edited except API wiring.</w:t>
       </w:r>
     </w:p>
     <w:p>
@@ -3074,7 +3476,7 @@
           <w:color w:val="333333"/>
           <w:sz w:val="18"/>
         </w:rPr>
-        <w:t>Every PR must pass npm run build and npm run lint (add GitHub Action). Block merge on failure. Add npm audit on PRs touching dependencies.</w:t>
+        <w:t>Every PR must pass npm run build + lint. Add Vitest + Playwright to CI — block merge on failure. npm audit on dependency PRs.</w:t>
       </w:r>
     </w:p>
     <w:p>
@@ -3089,7 +3491,7 @@
           <w:color w:val="1E293B"/>
           <w:sz w:val="18"/>
         </w:rPr>
-        <w:t>Commits</w:t>
+        <w:t>Contracts First</w:t>
       </w:r>
     </w:p>
     <w:p>
@@ -3104,7 +3506,7 @@
           <w:color w:val="333333"/>
           <w:sz w:val="18"/>
         </w:rPr>
-        <w:t>Conventional style (feat:, fix:, docs:). Example: "Refocus hero copy on investment returns and fix logo white box". Keeps changelog readable for CEO.</w:t>
+        <w:t>Define API types early (Day 1) matching src/types/index.ts — so frontend can wire with mocks while backend builds.</w:t>
       </w:r>
     </w:p>
     <w:p>
@@ -3119,7 +3521,7 @@
           <w:color w:val="1E293B"/>
           <w:sz w:val="18"/>
         </w:rPr>
-        <w:t>Code Review Checklist</w:t>
+        <w:t>Daily Review</w:t>
       </w:r>
     </w:p>
     <w:p>
@@ -3134,7 +3536,7 @@
           <w:color w:val="333333"/>
           <w:sz w:val="18"/>
         </w:rPr>
-        <w:t>Types correct, no secrets in repo, API error states handled, loading/empty states, mobile responsive, copy matches approved doc.</w:t>
+        <w:t>15-min standup + 30-min demo at 5pm with Vercel preview link. CEO gives feedback same day on trustee copy / dividend display.</w:t>
       </w:r>
     </w:p>
     <w:p>
@@ -3152,7 +3554,7 @@
           <w:color w:val="870F73"/>
           <w:sz w:val="36"/>
         </w:rPr>
-        <w:t>9  Testing Strategy — Built In From Day One</w:t>
+        <w:t>8  Testing Strategy — Built In Every Day</w:t>
       </w:r>
     </w:p>
     <w:p>
@@ -3167,22 +3569,7 @@
           <w:color w:val="475569"/>
           <w:sz w:val="18"/>
         </w:rPr>
-        <w:t>Testing is not a final phase. Every feature lands with its tests. The CEO sees the test report at each demo.</w:t>
-      </w:r>
-    </w:p>
-    <w:p>
-      <w:pPr>
-        <w:pStyle w:val="Heading2"/>
-        <w:spacing w:before="200" w:after="120"/>
-      </w:pPr>
-      <w:r>
-        <w:rPr>
-          <w:rFonts w:ascii="Calibri" w:hAnsi="Calibri"/>
-          <w:b/>
-          <w:color w:val="1E293B"/>
-          <w:sz w:val="22"/>
-        </w:rPr>
-        <w:t>9.1  Test pyramid</w:t>
+        <w:t>Testing is not Day 7 only. Each day lands with tests. CEO sees test report at each 5pm demo.</w:t>
       </w:r>
     </w:p>
     <w:tbl>
@@ -3224,7 +3611,7 @@
         </w:tc>
         <w:tc>
           <w:tcPr>
-            <w:tcW w:type="dxa" w:w="2304"/>
+            <w:tcW w:type="dxa" w:w="2160"/>
             <w:vAlign w:val="center"/>
             <w:shd w:val="clear" w:color="auto" w:fill="870F73"/>
           </w:tcPr>
@@ -3246,7 +3633,7 @@
         </w:tc>
         <w:tc>
           <w:tcPr>
-            <w:tcW w:type="dxa" w:w="3312"/>
+            <w:tcW w:type="dxa" w:w="3888"/>
             <w:vAlign w:val="center"/>
             <w:shd w:val="clear" w:color="auto" w:fill="870F73"/>
           </w:tcPr>
@@ -3268,7 +3655,7 @@
         </w:tc>
         <w:tc>
           <w:tcPr>
-            <w:tcW w:type="dxa" w:w="2016"/>
+            <w:tcW w:type="dxa" w:w="1728"/>
             <w:vAlign w:val="center"/>
             <w:shd w:val="clear" w:color="auto" w:fill="870F73"/>
           </w:tcPr>
@@ -3284,7 +3671,7 @@
                 <w:color w:val="FFFFFF"/>
                 <w:sz w:val="16"/>
               </w:rPr>
-              <w:t>Target</w:t>
+              <w:t>When</w:t>
             </w:r>
           </w:p>
         </w:tc>
@@ -3313,7 +3700,7 @@
         </w:tc>
         <w:tc>
           <w:tcPr>
-            <w:tcW w:type="dxa" w:w="2304"/>
+            <w:tcW w:type="dxa" w:w="2160"/>
             <w:vAlign w:val="center"/>
           </w:tcPr>
           <w:p>
@@ -3333,7 +3720,7 @@
         </w:tc>
         <w:tc>
           <w:tcPr>
-            <w:tcW w:type="dxa" w:w="3312"/>
+            <w:tcW w:type="dxa" w:w="3888"/>
             <w:vAlign w:val="center"/>
           </w:tcPr>
           <w:p>
@@ -3347,19 +3734,19 @@
                 <w:color w:val="333333"/>
                 <w:sz w:val="16"/>
               </w:rPr>
-              <w:t>lib/utils, stores, components, ROI calculator math</w:t>
+              <w:t>utils (formatCurrency/formatPercent, ROI calc), stores</w:t>
             </w:r>
           </w:p>
         </w:tc>
         <w:tc>
           <w:tcPr>
-            <w:tcW w:type="dxa" w:w="2016"/>
+            <w:tcW w:type="dxa" w:w="1728"/>
             <w:vAlign w:val="center"/>
           </w:tcPr>
           <w:p>
             <w:pPr>
               <w:spacing w:after="40" w:before="40"/>
-              <w:jc w:val="left"/>
+              <w:jc w:val="center"/>
             </w:pPr>
             <w:r>
               <w:rPr>
@@ -3367,7 +3754,7 @@
                 <w:color w:val="333333"/>
                 <w:sz w:val="16"/>
               </w:rPr>
-              <w:t>&gt;70% lines</w:t>
+              <w:t>Daily, &gt;70% lines</w:t>
             </w:r>
           </w:p>
         </w:tc>
@@ -3396,7 +3783,7 @@
         </w:tc>
         <w:tc>
           <w:tcPr>
-            <w:tcW w:type="dxa" w:w="2304"/>
+            <w:tcW w:type="dxa" w:w="2160"/>
             <w:vAlign w:val="center"/>
           </w:tcPr>
           <w:p>
@@ -3416,7 +3803,7 @@
         </w:tc>
         <w:tc>
           <w:tcPr>
-            <w:tcW w:type="dxa" w:w="3312"/>
+            <w:tcW w:type="dxa" w:w="3888"/>
             <w:vAlign w:val="center"/>
           </w:tcPr>
           <w:p>
@@ -3430,19 +3817,19 @@
                 <w:color w:val="333333"/>
                 <w:sz w:val="16"/>
               </w:rPr>
-              <w:t>lib/api.ts, auth/KYC flows, portfolio data fetching</w:t>
+              <w:t>api.ts, KYC, marketplace filters, dividends logic</w:t>
             </w:r>
           </w:p>
         </w:tc>
         <w:tc>
           <w:tcPr>
-            <w:tcW w:type="dxa" w:w="2016"/>
+            <w:tcW w:type="dxa" w:w="1728"/>
             <w:vAlign w:val="center"/>
           </w:tcPr>
           <w:p>
             <w:pPr>
               <w:spacing w:after="40" w:before="40"/>
-              <w:jc w:val="left"/>
+              <w:jc w:val="center"/>
             </w:pPr>
             <w:r>
               <w:rPr>
@@ -3450,7 +3837,7 @@
                 <w:color w:val="333333"/>
                 <w:sz w:val="16"/>
               </w:rPr>
-              <w:t>All API contracts</w:t>
+              <w:t>Daily</w:t>
             </w:r>
           </w:p>
         </w:tc>
@@ -3479,7 +3866,7 @@
         </w:tc>
         <w:tc>
           <w:tcPr>
-            <w:tcW w:type="dxa" w:w="2304"/>
+            <w:tcW w:type="dxa" w:w="2160"/>
             <w:vAlign w:val="center"/>
           </w:tcPr>
           <w:p>
@@ -3499,7 +3886,7 @@
         </w:tc>
         <w:tc>
           <w:tcPr>
-            <w:tcW w:type="dxa" w:w="3312"/>
+            <w:tcW w:type="dxa" w:w="3888"/>
             <w:vAlign w:val="center"/>
           </w:tcPr>
           <w:p>
@@ -3513,19 +3900,19 @@
                 <w:color w:val="333333"/>
                 <w:sz w:val="16"/>
               </w:rPr>
-              <w:t>Critical investor journeys (see 9.2)</w:t>
+              <w:t>Large allocation (₦10M+) → trustee hold → wallet dividends → term ROI</w:t>
             </w:r>
           </w:p>
         </w:tc>
         <w:tc>
           <w:tcPr>
-            <w:tcW w:type="dxa" w:w="2016"/>
+            <w:tcW w:type="dxa" w:w="1728"/>
             <w:vAlign w:val="center"/>
           </w:tcPr>
           <w:p>
             <w:pPr>
               <w:spacing w:after="40" w:before="40"/>
-              <w:jc w:val="left"/>
+              <w:jc w:val="center"/>
             </w:pPr>
             <w:r>
               <w:rPr>
@@ -3533,7 +3920,7 @@
                 <w:color w:val="333333"/>
                 <w:sz w:val="16"/>
               </w:rPr>
-              <w:t>100% critical paths</w:t>
+              <w:t>D3–D7 green</w:t>
             </w:r>
           </w:p>
         </w:tc>
@@ -3562,7 +3949,7 @@
         </w:tc>
         <w:tc>
           <w:tcPr>
-            <w:tcW w:type="dxa" w:w="2304"/>
+            <w:tcW w:type="dxa" w:w="2160"/>
             <w:vAlign w:val="center"/>
           </w:tcPr>
           <w:p>
@@ -3576,13 +3963,13 @@
                 <w:color w:val="333333"/>
                 <w:sz w:val="16"/>
               </w:rPr>
-              <w:t>Chromatic or manual diff</w:t>
+              <w:t>Chromatic/manual</w:t>
             </w:r>
           </w:p>
         </w:tc>
         <w:tc>
           <w:tcPr>
-            <w:tcW w:type="dxa" w:w="3312"/>
+            <w:tcW w:type="dxa" w:w="3888"/>
             <w:vAlign w:val="center"/>
           </w:tcPr>
           <w:p>
@@ -3596,19 +3983,19 @@
                 <w:color w:val="333333"/>
                 <w:sz w:val="16"/>
               </w:rPr>
-              <w:t>Hero, marketplace cards, logo (h-10 white, no box)</w:t>
+              <w:t>Hero ₦10M–₦100M slider, white logo h-10 transparent, no box</w:t>
             </w:r>
           </w:p>
         </w:tc>
         <w:tc>
           <w:tcPr>
-            <w:tcW w:type="dxa" w:w="2016"/>
+            <w:tcW w:type="dxa" w:w="1728"/>
             <w:vAlign w:val="center"/>
           </w:tcPr>
           <w:p>
             <w:pPr>
               <w:spacing w:after="40" w:before="40"/>
-              <w:jc w:val="left"/>
+              <w:jc w:val="center"/>
             </w:pPr>
             <w:r>
               <w:rPr>
@@ -3616,7 +4003,7 @@
                 <w:color w:val="333333"/>
                 <w:sz w:val="16"/>
               </w:rPr>
-              <w:t>No regressions</w:t>
+              <w:t>D6 no regression</w:t>
             </w:r>
           </w:p>
         </w:tc>
@@ -3645,7 +4032,7 @@
         </w:tc>
         <w:tc>
           <w:tcPr>
-            <w:tcW w:type="dxa" w:w="2304"/>
+            <w:tcW w:type="dxa" w:w="2160"/>
             <w:vAlign w:val="center"/>
           </w:tcPr>
           <w:p>
@@ -3659,13 +4046,13 @@
                 <w:color w:val="333333"/>
                 <w:sz w:val="16"/>
               </w:rPr>
-              <w:t>npm audit + headers check</w:t>
+              <w:t>npm audit + headers</w:t>
             </w:r>
           </w:p>
         </w:tc>
         <w:tc>
           <w:tcPr>
-            <w:tcW w:type="dxa" w:w="3312"/>
+            <w:tcW w:type="dxa" w:w="3888"/>
             <w:vAlign w:val="center"/>
           </w:tcPr>
           <w:p>
@@ -3679,19 +4066,19 @@
                 <w:color w:val="333333"/>
                 <w:sz w:val="16"/>
               </w:rPr>
-              <w:t>Dependencies, vercel.json headers</w:t>
+              <w:t>deps, vercel.json headers</w:t>
             </w:r>
           </w:p>
         </w:tc>
         <w:tc>
           <w:tcPr>
-            <w:tcW w:type="dxa" w:w="2016"/>
+            <w:tcW w:type="dxa" w:w="1728"/>
             <w:vAlign w:val="center"/>
           </w:tcPr>
           <w:p>
             <w:pPr>
               <w:spacing w:after="40" w:before="40"/>
-              <w:jc w:val="left"/>
+              <w:jc w:val="center"/>
             </w:pPr>
             <w:r>
               <w:rPr>
@@ -3728,7 +4115,7 @@
         </w:tc>
         <w:tc>
           <w:tcPr>
-            <w:tcW w:type="dxa" w:w="2304"/>
+            <w:tcW w:type="dxa" w:w="2160"/>
             <w:vAlign w:val="center"/>
           </w:tcPr>
           <w:p>
@@ -3748,7 +4135,7 @@
         </w:tc>
         <w:tc>
           <w:tcPr>
-            <w:tcW w:type="dxa" w:w="3312"/>
+            <w:tcW w:type="dxa" w:w="3888"/>
             <w:vAlign w:val="center"/>
           </w:tcPr>
           <w:p>
@@ -3768,13 +4155,13 @@
         </w:tc>
         <w:tc>
           <w:tcPr>
-            <w:tcW w:type="dxa" w:w="2016"/>
+            <w:tcW w:type="dxa" w:w="1728"/>
             <w:vAlign w:val="center"/>
           </w:tcPr>
           <w:p>
             <w:pPr>
               <w:spacing w:after="40" w:before="40"/>
-              <w:jc w:val="left"/>
+              <w:jc w:val="center"/>
             </w:pPr>
             <w:r>
               <w:rPr>
@@ -3805,7 +4192,7 @@
           <w:color w:val="1E293B"/>
           <w:sz w:val="22"/>
         </w:rPr>
-        <w:t>9.2  Critical E2E scenarios (must pass before any release)</w:t>
+        <w:t>Critical E2E scenarios (must pass before launch)</w:t>
       </w:r>
     </w:p>
     <w:p>
@@ -3820,7 +4207,7 @@
           <w:color w:val="333333"/>
           <w:sz w:val="18"/>
         </w:rPr>
-        <w:t>1. Signup → OTP → Marketplace → Asset Detail → Checkout → Success → Portfolio shows new holding + projected returns.</w:t>
+        <w:t>1. Allocate ₦10M+ → OTP → checkout success → portfolio shows Held by Trustees + term ROI.</w:t>
       </w:r>
     </w:p>
     <w:p>
@@ -3835,7 +4222,7 @@
           <w:color w:val="333333"/>
           <w:sz w:val="18"/>
         </w:rPr>
-        <w:t>2. Login → Wallet → Dividends (quarterly earnings display).</w:t>
+        <w:t>2. Quarterly dividend lands in Wallet → appears in Portfolio &amp; Dividends history.</w:t>
       </w:r>
     </w:p>
     <w:p>
@@ -3850,7 +4237,7 @@
           <w:color w:val="333333"/>
           <w:sz w:val="18"/>
         </w:rPr>
-        <w:t>3. Landing: trustee How-It-Works visible, ROI calculator updates correctly, white logo renders at h-10 with no container/box.</w:t>
+        <w:t>3. At term: capital + 22.5% p.a. settled → portfolio reflects closed position.</w:t>
       </w:r>
     </w:p>
     <w:p>
@@ -3865,7 +4252,7 @@
           <w:color w:val="333333"/>
           <w:sz w:val="18"/>
         </w:rPr>
-        <w:t>4. KYC: profile creation → status reflected in dashboard.</w:t>
+        <w:t>4. KYC document upload → status in profile/KYC page updates.</w:t>
       </w:r>
     </w:p>
     <w:p>
@@ -3880,22 +4267,7 @@
           <w:color w:val="333333"/>
           <w:sz w:val="18"/>
         </w:rPr>
-        <w:t>5. Error states: API down → graceful message, no white screen.</w:t>
-      </w:r>
-    </w:p>
-    <w:p>
-      <w:pPr>
-        <w:pStyle w:val="Heading3"/>
-        <w:spacing w:before="200" w:after="120"/>
-      </w:pPr>
-      <w:r>
-        <w:rPr>
-          <w:rFonts w:ascii="Calibri" w:hAnsi="Calibri"/>
-          <w:b/>
-          <w:color w:val="475569"/>
-          <w:sz w:val="18"/>
-        </w:rPr>
-        <w:t>9.3  Scripts to add to package.json</w:t>
+        <w:t>5. Landing high-investment copy correct: Deploy Large Capital, ₦10M–₦100M slider, Avg Ticket ₦15M+.</w:t>
       </w:r>
     </w:p>
     <w:p>
@@ -3915,21 +4287,6 @@
     </w:p>
     <w:p>
       <w:pPr>
-        <w:pStyle w:val="Heading3"/>
-        <w:spacing w:before="200" w:after="120"/>
-      </w:pPr>
-      <w:r>
-        <w:rPr>
-          <w:rFonts w:ascii="Calibri" w:hAnsi="Calibri"/>
-          <w:b/>
-          <w:color w:val="1E293B"/>
-          <w:sz w:val="18"/>
-        </w:rPr>
-        <w:t>9.4  UAT (CEO + 3–5 real investors)</w:t>
-      </w:r>
-    </w:p>
-    <w:p>
-      <w:pPr>
         <w:spacing w:after="80" w:before="0" w:line="264" w:lineRule="auto"/>
       </w:pPr>
       <w:r>
@@ -3940,25 +4297,22 @@
           <w:color w:val="333333"/>
           <w:sz w:val="18"/>
         </w:rPr>
-        <w:t>Before each release: run UAT checklist in a GitHub Issue, collect sign-off comments. UAT blocks production promotion. Checklist covers investment flow, trustee copy accuracy, wallet/dividends numbers, and mobile experience.</w:t>
+        <w:t>UAT (CEO + 2 high-value personas): run checklist in GitHub Issue on D7. Blocks production promotion. Covers large allocation, trustee copy, dividend amounts, portfolio math, mobile experience.</w:t>
       </w:r>
     </w:p>
     <w:p>
       <w:pPr>
-        <w:pStyle w:val="Heading1"/>
-        <w:spacing w:before="280" w:after="120"/>
-        <w:pBdr>
-          <w:bottom w:val="single" w:sz="6" w:space="4" w:color="D4A065"/>
-        </w:pBdr>
+        <w:pStyle w:val="Heading2"/>
+        <w:spacing w:before="200" w:after="120"/>
       </w:pPr>
       <w:r>
         <w:rPr>
           <w:rFonts w:ascii="Calibri" w:hAnsi="Calibri"/>
           <w:b/>
-          <w:color w:val="870F73"/>
-          <w:sz w:val="36"/>
+          <w:color w:val="1E293B"/>
+          <w:sz w:val="22"/>
         </w:rPr>
-        <w:t>10  Environments &amp; Deployment</w:t>
+        <w:t>Environments &amp; Deployment</w:t>
       </w:r>
     </w:p>
     <w:tbl>
@@ -4100,7 +4454,7 @@
                 <w:color w:val="333333"/>
                 <w:sz w:val="16"/>
               </w:rPr>
-              <w:t>Developer machine</w:t>
+              <w:t>Dev machine</w:t>
             </w:r>
           </w:p>
         </w:tc>
@@ -4163,7 +4517,7 @@
                 <w:color w:val="333333"/>
                 <w:sz w:val="16"/>
               </w:rPr>
-              <w:t>Share link with CEO for copy review</w:t>
+              <w:t>Share with CEO daily</w:t>
             </w:r>
           </w:p>
         </w:tc>
@@ -4206,7 +4560,7 @@
                 <w:color w:val="333333"/>
                 <w:sz w:val="16"/>
               </w:rPr>
-              <w:t>Vercel main (auto-deploy)</w:t>
+              <w:t>Vercel main (auto)</w:t>
             </w:r>
           </w:p>
         </w:tc>
@@ -4226,7 +4580,7 @@
                 <w:color w:val="333333"/>
                 <w:sz w:val="16"/>
               </w:rPr>
-              <w:t>FRA1, env: NEXT_PUBLIC_API_URL, ENABLE_* flags</w:t>
+              <w:t>FRA1, env NEXT_PUBLIC_API_URL, ENABLE_*</w:t>
             </w:r>
           </w:p>
         </w:tc>
@@ -4249,7 +4603,7 @@
           <w:color w:val="475569"/>
           <w:sz w:val="17"/>
         </w:rPr>
-        <w:t>If deployed copy looks stale: check Vercel dashboard → last deployment SHA matches GitHub main HEAD. Trigger manual redeploy if needed. Rollback is instant via Vercel dashboard.</w:t>
+        <w:t>If copy looks stale, check Vercel dashboard SHA matches main HEAD. Instant rollback available.</w:t>
       </w:r>
     </w:p>
     <w:p>
@@ -4267,7 +4621,7 @@
           <w:color w:val="870F73"/>
           <w:sz w:val="36"/>
         </w:rPr>
-        <w:t>11  Risks &amp; Mitigations</w:t>
+        <w:t>9  Risks &amp; Mitigations (1-Week Context)</w:t>
       </w:r>
     </w:p>
     <w:tbl>
@@ -4369,7 +4723,70 @@
                 <w:color w:val="333333"/>
                 <w:sz w:val="16"/>
               </w:rPr>
-              <w:t>Trustee API delay</w:t>
+              <w:t>Scope creep to Phase 1 retail instalments</w:t>
+            </w:r>
+          </w:p>
+        </w:tc>
+        <w:tc>
+          <w:tcPr>
+            <w:tcW w:type="dxa" w:w="1296"/>
+            <w:vAlign w:val="center"/>
+          </w:tcPr>
+          <w:p>
+            <w:pPr>
+              <w:spacing w:after="40" w:before="40"/>
+              <w:jc w:val="left"/>
+            </w:pPr>
+            <w:r>
+              <w:rPr>
+                <w:rFonts w:ascii="Calibri" w:hAnsi="Calibri"/>
+                <w:color w:val="333333"/>
+                <w:sz w:val="16"/>
+              </w:rPr>
+              <w:t>Medium</w:t>
+            </w:r>
+          </w:p>
+        </w:tc>
+        <w:tc>
+          <w:tcPr>
+            <w:tcW w:type="dxa" w:w="5616"/>
+            <w:vAlign w:val="center"/>
+          </w:tcPr>
+          <w:p>
+            <w:pPr>
+              <w:spacing w:after="40" w:before="40"/>
+              <w:jc w:val="left"/>
+            </w:pPr>
+            <w:r>
+              <w:rPr>
+                <w:rFonts w:ascii="Calibri" w:hAnsi="Calibri"/>
+                <w:color w:val="333333"/>
+                <w:sz w:val="16"/>
+              </w:rPr>
+              <w:t>Keep full allocation only — no 3/6/12 month plans in high-value MVP</w:t>
+            </w:r>
+          </w:p>
+        </w:tc>
+      </w:tr>
+      <w:tr>
+        <w:tc>
+          <w:tcPr>
+            <w:tcW w:type="dxa" w:w="2304"/>
+            <w:vAlign w:val="center"/>
+          </w:tcPr>
+          <w:p>
+            <w:pPr>
+              <w:spacing w:after="40" w:before="40"/>
+              <w:jc w:val="left"/>
+            </w:pPr>
+            <w:r>
+              <w:rPr>
+                <w:rFonts w:ascii="Calibri" w:hAnsi="Calibri"/>
+                <w:b/>
+                <w:color w:val="333333"/>
+                <w:sz w:val="16"/>
+              </w:rPr>
+              <w:t>Trustee milestone ambiguity</w:t>
             </w:r>
           </w:p>
         </w:tc>
@@ -4409,7 +4826,7 @@
                 <w:color w:val="333333"/>
                 <w:sz w:val="16"/>
               </w:rPr>
-              <w:t>Mock API + contract-first dev; feature flags to swap real/mocked</w:t>
+              <w:t>CEO to confirm triggers D1 (foundation/roofing/handover) — block Day 3 without it</w:t>
             </w:r>
           </w:p>
         </w:tc>
@@ -4432,7 +4849,7 @@
                 <w:color w:val="333333"/>
                 <w:sz w:val="16"/>
               </w:rPr>
-              <w:t>Copy/design drift</w:t>
+              <w:t>Frontend freeze broken</w:t>
             </w:r>
           </w:p>
         </w:tc>
@@ -4472,7 +4889,7 @@
                 <w:color w:val="333333"/>
                 <w:sz w:val="16"/>
               </w:rPr>
-              <w:t>Single source: landing-page.tsx; CEO copy freeze at M3 (Week 7)</w:t>
+              <w:t>No edits to landing/marketplace except API wiring; copy frozen at this plan</w:t>
             </w:r>
           </w:p>
         </w:tc>
@@ -4495,7 +4912,7 @@
                 <w:color w:val="333333"/>
                 <w:sz w:val="16"/>
               </w:rPr>
-              <w:t>Logo/asset quality</w:t>
+              <w:t>Logo/box regression</w:t>
             </w:r>
           </w:p>
         </w:tc>
@@ -4535,7 +4952,7 @@
                 <w:color w:val="333333"/>
                 <w:sz w:val="16"/>
               </w:rPr>
-              <w:t>Use urbco-logo-white.svg (white, transparent, h-10) on dark; urbco-logo.svg (purple) on light</w:t>
+              <w:t>White logo urbco-logo-white.svg (transparent, h-10) on dark; purple on light — verified D6</w:t>
             </w:r>
           </w:p>
         </w:tc>
@@ -4558,7 +4975,7 @@
                 <w:color w:val="333333"/>
                 <w:sz w:val="16"/>
               </w:rPr>
-              <w:t>Test gap / regressions</w:t>
+              <w:t>Compressed testing</w:t>
             </w:r>
           </w:p>
         </w:tc>
@@ -4598,70 +5015,7 @@
                 <w:color w:val="333333"/>
                 <w:sz w:val="16"/>
               </w:rPr>
-              <w:t>No merge without tests for new features; Playwright on CI</w:t>
-            </w:r>
-          </w:p>
-        </w:tc>
-      </w:tr>
-      <w:tr>
-        <w:tc>
-          <w:tcPr>
-            <w:tcW w:type="dxa" w:w="2304"/>
-            <w:vAlign w:val="center"/>
-          </w:tcPr>
-          <w:p>
-            <w:pPr>
-              <w:spacing w:after="40" w:before="40"/>
-              <w:jc w:val="left"/>
-            </w:pPr>
-            <w:r>
-              <w:rPr>
-                <w:rFonts w:ascii="Calibri" w:hAnsi="Calibri"/>
-                <w:b/>
-                <w:color w:val="333333"/>
-                <w:sz w:val="16"/>
-              </w:rPr>
-              <w:t>Scope creep (trading, admin)</w:t>
-            </w:r>
-          </w:p>
-        </w:tc>
-        <w:tc>
-          <w:tcPr>
-            <w:tcW w:type="dxa" w:w="1296"/>
-            <w:vAlign w:val="center"/>
-          </w:tcPr>
-          <w:p>
-            <w:pPr>
-              <w:spacing w:after="40" w:before="40"/>
-              <w:jc w:val="left"/>
-            </w:pPr>
-            <w:r>
-              <w:rPr>
-                <w:rFonts w:ascii="Calibri" w:hAnsi="Calibri"/>
-                <w:color w:val="333333"/>
-                <w:sz w:val="16"/>
-              </w:rPr>
-              <w:t>Medium</w:t>
-            </w:r>
-          </w:p>
-        </w:tc>
-        <w:tc>
-          <w:tcPr>
-            <w:tcW w:type="dxa" w:w="5616"/>
-            <w:vAlign w:val="center"/>
-          </w:tcPr>
-          <w:p>
-            <w:pPr>
-              <w:spacing w:after="40" w:before="40"/>
-              <w:jc w:val="left"/>
-            </w:pPr>
-            <w:r>
-              <w:rPr>
-                <w:rFonts w:ascii="Calibri" w:hAnsi="Calibri"/>
-                <w:color w:val="333333"/>
-                <w:sz w:val="16"/>
-              </w:rPr>
-              <w:t>Park in Phase 2 backlog; require CEO + Dev joint approval to pull forward</w:t>
+              <w:t>Tests written alongside code daily (not D7); E2E runs on CI every PR</w:t>
             </w:r>
           </w:p>
         </w:tc>
@@ -4687,7 +5041,7 @@
           <w:color w:val="870F73"/>
           <w:sz w:val="36"/>
         </w:rPr>
-        <w:t>12  Communication &amp; Review Cadence</w:t>
+        <w:t>10  Communication &amp; Review Cadence</w:t>
       </w:r>
     </w:p>
     <w:p>
@@ -4703,7 +5057,7 @@
           <w:color w:val="333333"/>
           <w:sz w:val="18"/>
         </w:rPr>
-        <w:t>Weekly 30-min Demo (Friday): Dev shows Vercel preview URL; CEO gives copy/UX feedback same day — prevents rework.</w:t>
+        <w:t>Daily 5pm Demo (15 min): Dev shows Vercel preview; CEO signs off same day — prevents overnight rework.</w:t>
       </w:r>
     </w:p>
     <w:p>
@@ -4719,7 +5073,7 @@
           <w:color w:val="333333"/>
           <w:sz w:val="18"/>
         </w:rPr>
-        <w:t>Async: GitHub Issues for bugs/decisions, PR comments for implementation details. No long email threads.</w:t>
+        <w:t>Async: GitHub Issues for bugs/decisions, PR comments for code. No long email threads.</w:t>
       </w:r>
     </w:p>
     <w:p>
@@ -4735,7 +5089,7 @@
           <w:color w:val="333333"/>
           <w:sz w:val="18"/>
         </w:rPr>
-        <w:t>Decision log: keep a pinned Issue "Decisions" — records scope, copy, and timeline changes with date + owner.</w:t>
+        <w:t>Decision log: pinned Issue ‘Decisions’ — records scope/copy changes with date + owner.</w:t>
       </w:r>
     </w:p>
     <w:p>
@@ -4753,7 +5107,7 @@
           <w:color w:val="870F73"/>
           <w:sz w:val="36"/>
         </w:rPr>
-        <w:t>13  Budget &amp; Resources (for CEO planning)</w:t>
+        <w:t>11  Budget &amp; Resources (CEO Planning)</w:t>
       </w:r>
     </w:p>
     <w:p>
@@ -4768,7 +5122,7 @@
           <w:color w:val="333333"/>
           <w:sz w:val="18"/>
         </w:rPr>
-        <w:t>Costs are primarily developer time + Vercel (free/pro) + API hosting (api.urbcoinvest.com) + domain. No additional license cost for proposed testing stack (Vitest/Playwright are open-source). If QA is external, budget ~15–20% of dev time for manual UAT. Add KYC provider fees if moving beyond light KYC.</w:t>
+        <w:t>Frontend cost is sunk (complete). 1-week cost = backend dev time + Vercel/API hosting + domain. Testing stack (Vitest/Playwright) is open-source. KYC provider fees only if moving beyond light KYC.</w:t>
       </w:r>
     </w:p>
     <w:tbl>
@@ -4870,7 +5224,7 @@
                 <w:color w:val="333333"/>
                 <w:sz w:val="16"/>
               </w:rPr>
-              <w:t>Developer</w:t>
+              <w:t>Backend Developer</w:t>
             </w:r>
           </w:p>
         </w:tc>
@@ -4890,7 +5244,7 @@
                 <w:color w:val="333333"/>
                 <w:sz w:val="16"/>
               </w:rPr>
-              <w:t>1 FTE × 10 weeks</w:t>
+              <w:t>1 FTE × 7 days</w:t>
             </w:r>
           </w:p>
         </w:tc>
@@ -4910,7 +5264,7 @@
                 <w:color w:val="333333"/>
                 <w:sz w:val="16"/>
               </w:rPr>
-              <w:t>Core build</w:t>
+              <w:t>Core build + integration</w:t>
             </w:r>
           </w:p>
         </w:tc>
@@ -4953,7 +5307,7 @@
                 <w:color w:val="333333"/>
                 <w:sz w:val="16"/>
               </w:rPr>
-              <w:t>~0.2 FTE</w:t>
+              <w:t>~0.3 FTE in week</w:t>
             </w:r>
           </w:p>
         </w:tc>
@@ -4973,7 +5327,7 @@
                 <w:color w:val="333333"/>
                 <w:sz w:val="16"/>
               </w:rPr>
-              <w:t>Manual + E2E maintenance</w:t>
+              <w:t>E2E + CEO walkthrough D6–D7</w:t>
             </w:r>
           </w:p>
         </w:tc>
@@ -5036,7 +5390,7 @@
                 <w:color w:val="333333"/>
                 <w:sz w:val="16"/>
               </w:rPr>
-              <w:t>Preview + prod deploys</w:t>
+              <w:t>Preview + prod</w:t>
             </w:r>
           </w:p>
         </w:tc>
@@ -5059,7 +5413,7 @@
                 <w:color w:val="333333"/>
                 <w:sz w:val="16"/>
               </w:rPr>
-              <w:t>Design (if needed)</w:t>
+              <w:t>Design</w:t>
             </w:r>
           </w:p>
         </w:tc>
@@ -5079,7 +5433,7 @@
                 <w:color w:val="333333"/>
                 <w:sz w:val="16"/>
               </w:rPr>
-              <w:t>As-needed</w:t>
+              <w:t>Frozen</w:t>
             </w:r>
           </w:p>
         </w:tc>
@@ -5099,7 +5453,7 @@
                 <w:color w:val="333333"/>
                 <w:sz w:val="16"/>
               </w:rPr>
-              <w:t>Figma updates, investor stories</w:t>
+              <w:t>No cost — 19 sides already confirmed</w:t>
             </w:r>
           </w:p>
         </w:tc>
@@ -5125,7 +5479,7 @@
           <w:color w:val="870F73"/>
           <w:sz w:val="36"/>
         </w:rPr>
-        <w:t>14  Next Steps — For Joint Review</w:t>
+        <w:t>12  Next Steps — For Joint Review (This Week)</w:t>
       </w:r>
     </w:p>
     <w:p>
@@ -5140,7 +5494,7 @@
           <w:color w:val="1E40AF"/>
           <w:sz w:val="18"/>
         </w:rPr>
-        <w:t xml:space="preserve">  ACTION REQUIRED — Please confirm in the review meeting:</w:t>
+        <w:t xml:space="preserve">  ACTION REQUIRED — Confirm at kickoff TODAY:</w:t>
       </w:r>
     </w:p>
     <w:p>
@@ -5155,7 +5509,7 @@
           <w:color w:val="333333"/>
           <w:sz w:val="18"/>
         </w:rPr>
-        <w:t>1.  CEO confirms trustee milestone definitions (what exactly triggers a release — e.g., foundation, roofing, handover). Needed before Phase 2.</w:t>
+        <w:t>1.  CEO confirms trustee milestone triggers (what releases funds — e.g., foundation completed, roofing, handover). Needed for Day 3.</w:t>
       </w:r>
     </w:p>
     <w:p>
@@ -5170,7 +5524,7 @@
           <w:color w:val="333333"/>
           <w:sz w:val="18"/>
         </w:rPr>
-        <w:t>2.  CEO approves scope split (MVP vs Phase 2) — especially secondary market &amp; admin dashboard being out of MVP.</w:t>
+        <w:t>2.  CEO approves high-investment scope: ₦10M–₦100M+ full allocation only (no instalments in MVP) and confirmed 19 sides are frozen.</w:t>
       </w:r>
     </w:p>
     <w:p>
@@ -5185,7 +5539,7 @@
           <w:color w:val="333333"/>
           <w:sz w:val="18"/>
         </w:rPr>
-        <w:t>3.  Dev creates GitHub Project board with milestones M1–M5 and adds CI workflow (build + lint + test) to block bad merges.</w:t>
+        <w:t>3.  Dev creates GitHub Project board with D1–D7 cards and adds CI (build + lint + test) to block bad merges — today.</w:t>
       </w:r>
     </w:p>
     <w:p>
@@ -5200,7 +5554,7 @@
           <w:color w:val="333333"/>
           <w:sz w:val="18"/>
         </w:rPr>
-        <w:t>4.  Add Vitest + Playwright and land first 5 tests (auth, checkout, ROI calculator) — due end of Week 1.</w:t>
+        <w:t>4.  Add Vitest + Playwright and land first 5 tests (auth, allocate, dividends) — due end of Day 1.</w:t>
       </w:r>
     </w:p>
     <w:p>
@@ -5215,7 +5569,7 @@
           <w:color w:val="333333"/>
           <w:sz w:val="18"/>
         </w:rPr>
-        <w:t>5.  Schedule M1 demo for end of Week 2 (calendar invite + Vercel preview link).</w:t>
+        <w:t>5.  Schedule daily 5pm demos + D7 launch window (calendar invite + Vercel preview link).</w:t>
       </w:r>
     </w:p>
     <w:p>
@@ -5399,7 +5753,7 @@
                 <w:color w:val="333333"/>
                 <w:sz w:val="16"/>
               </w:rPr>
-              <w:t>Tech Lead / Developer</w:t>
+              <w:t>Backend Lead</w:t>
             </w:r>
           </w:p>
         </w:tc>
@@ -5465,7 +5819,7 @@
           <w:color w:val="870F73"/>
           <w:sz w:val="36"/>
         </w:rPr>
-        <w:t>Appendix A  Current Codebase Snapshot</w:t>
+        <w:t>Appendix A  Confirmed Sides — Frontend Frozen</w:t>
       </w:r>
     </w:p>
     <w:p>
@@ -5480,7 +5834,7 @@
           <w:color w:val="333333"/>
           <w:sz w:val="18"/>
         </w:rPr>
-        <w:t>Key files reviewed for this plan:</w:t>
+        <w:t>19 routes/pages reviewed and confirmed — no UI changes during 7-day backend sprint, only API wiring:</w:t>
       </w:r>
     </w:p>
     <w:p>
@@ -5496,7 +5850,7 @@
           <w:color w:val="333333"/>
           <w:sz w:val="17"/>
         </w:rPr>
-        <w:t>src/components/pages/landing-page.tsx — investment-led hero, trustee narrative, ROI calculator, white logo (h-10, transparent).</w:t>
+        <w:t>Landing / — hero Deploy Large Capital, stats Avg Ticket ₦15M+, calculator ₦10M–₦100M, dividends-in-app features, high-ticket testimonials.</w:t>
       </w:r>
     </w:p>
     <w:p>
@@ -5512,7 +5866,7 @@
           <w:color w:val="333333"/>
           <w:sz w:val="17"/>
         </w:rPr>
-        <w:t>public/urbco-logo.svg (purple) and public/urbco-logo-white.svg (white) — white version for dark landing nav/footer.</w:t>
+        <w:t>/auth/login, /auth/signup, /auth/otp-verify, /auth/forgot-password — light KYC onboarding.</w:t>
       </w:r>
     </w:p>
     <w:p>
@@ -5528,7 +5882,7 @@
           <w:color w:val="333333"/>
           <w:sz w:val="17"/>
         </w:rPr>
-        <w:t>src/lib/api.ts, src/lib/config.ts, src/stores/appStore.ts — API + state layer.</w:t>
+        <w:t>/marketplace (Own-a-Fraction) — grid/list, search, filters; /assets/[id] — gallery, funding, ROI, trustee markers.</w:t>
       </w:r>
     </w:p>
     <w:p>
@@ -5544,7 +5898,7 @@
           <w:color w:val="333333"/>
           <w:sz w:val="17"/>
         </w:rPr>
-        <w:t>vercel.json — buildCommand npm run build, regions [fra1], security headers.</w:t>
+        <w:t>/checkout/[id] + /checkout/success — single large allocation, receipt.</w:t>
       </w:r>
     </w:p>
     <w:p>
@@ -5560,7 +5914,55 @@
           <w:color w:val="333333"/>
           <w:sz w:val="17"/>
         </w:rPr>
-        <w:t>src/data/mockData.ts, src/app/*, src/components/pages/* — marketplace, asset detail, portfolio, wallet, etc.</w:t>
+        <w:t>/dashboard, /portfolio, /dividends, /wallet, /referrals, /notifications, /profile, /profile/kyc, /settings — all confirmed.</w:t>
+      </w:r>
+    </w:p>
+    <w:p>
+      <w:pPr>
+        <w:pStyle w:val="ListBullet"/>
+        <w:spacing w:after="80" w:before="0" w:line="264" w:lineRule="auto"/>
+      </w:pPr>
+      <w:r>
+        <w:rPr>
+          <w:rFonts w:ascii="Calibri" w:hAnsi="Calibri"/>
+          <w:b w:val="0"/>
+          <w:i w:val="0"/>
+          <w:color w:val="333333"/>
+          <w:sz w:val="17"/>
+        </w:rPr>
+        <w:t>Types src/types/index.ts, stores src/stores/appStore.ts, utils src/lib/utils.ts, config, validations — ready for backend types.</w:t>
+      </w:r>
+    </w:p>
+    <w:p>
+      <w:pPr>
+        <w:pStyle w:val="ListBullet"/>
+        <w:spacing w:after="80" w:before="0" w:line="264" w:lineRule="auto"/>
+      </w:pPr>
+      <w:r>
+        <w:rPr>
+          <w:rFonts w:ascii="Calibri" w:hAnsi="Calibri"/>
+          <w:b w:val="0"/>
+          <w:i w:val="0"/>
+          <w:color w:val="333333"/>
+          <w:sz w:val="17"/>
+        </w:rPr>
+        <w:t>Logos: public/urbco-logo.svg (purple, light bg) + public/urbco-logo-white.svg (white, transparent, h-10, dark bg).</w:t>
+      </w:r>
+    </w:p>
+    <w:p>
+      <w:pPr>
+        <w:pStyle w:val="ListBullet"/>
+        <w:spacing w:after="80" w:before="0" w:line="264" w:lineRule="auto"/>
+      </w:pPr>
+      <w:r>
+        <w:rPr>
+          <w:rFonts w:ascii="Calibri" w:hAnsi="Calibri"/>
+          <w:b w:val="0"/>
+          <w:i w:val="0"/>
+          <w:color w:val="333333"/>
+          <w:sz w:val="17"/>
+        </w:rPr>
+        <w:t>Infra: vercel.json (build npm run build, regions [fra1], security headers), .env.example flags ENABLE_*.</w:t>
       </w:r>
     </w:p>
     <w:p>
@@ -5575,7 +5977,7 @@
           <w:color w:val="475569"/>
           <w:sz w:val="16"/>
         </w:rPr>
-        <w:t>Import into Google Docs: Upload this .docx to drive.google.com → Open with Google Docs. Headings will appear in the outline (View → Show outline). Comments and suggestions can be added directly.</w:t>
+        <w:t>Import into Google Docs: Upload this .docx to drive.google.com → Open with Google Docs. Headings appear in outline (View → Show outline).</w:t>
       </w:r>
     </w:p>
     <w:sectPr>
@@ -5602,7 +6004,7 @@
         <w:color w:val="94A3B8"/>
         <w:sz w:val="14"/>
       </w:rPr>
-      <w:t>Urbco Investors App  •  Confidential  •  Trustee-Secured Fractional Real Estate</w:t>
+      <w:t>Urbco Investors App  •  High-Value Investing  •  Confidential  •  Trustee-Secured  •  Frontend Ready — Backend 1 Week</w:t>
     </w:r>
   </w:p>
 </w:ftr>

</xml_diff>